<commit_message>
docs: synchronize all model descriptions, metrics, thesis reports (.md and .docx), and README citations with published JUTIF 2025 paper (Chazar & Nugraha)
</commit_message>
<xml_diff>
--- a/LAPORAN_SKRIPSI_BAB3_BAB4.docx
+++ b/LAPORAN_SKRIPSI_BAB3_BAB4.docx
@@ -4,7 +4,7 @@
   <w:body>
     <w:p>
       <w:pPr>
-        <w:spacing w:after="480"/>
+        <w:spacing w:after="400"/>
         <w:jc w:val="center"/>
       </w:pPr>
       <w:r>
@@ -12,25 +12,29 @@
           <w:b/>
           <w:sz w:val="28"/>
         </w:rPr>
-        <w:t>DOKUMEN TEKNIS &amp; HASIL PENGUJIAN SISTEM</w:t>
+        <w:t>DOKUMEN METODOLOGI DAN EVALUASI HASIL PENELITIAN SKRIPSI</w:t>
         <w:br/>
       </w:r>
       <w:r>
         <w:rPr>
           <w:b/>
-          <w:sz w:val="28"/>
+          <w:sz w:val="26"/>
         </w:rPr>
-        <w:t>DETEKSI, PELACAKAN, DAN PENGHITUNGAN KENDARAAN</w:t>
+        <w:t>DETEKSI, PELACAKAN, DAN PENGHITUNGAN KENDARAAN PADA KONDISI HUJAN</w:t>
         <w:br/>
-        <w:t>BERBASIS DEYOLO DAN BYTETRACK PADA CUACA HUJAN</w:t>
+        <w:t>MENGGUNAKAN DUAL FEATURE ENHANCEMENT YOLO (DEYOLO) DAN BYTETRACK</w:t>
         <w:br/>
       </w:r>
       <w:r>
         <w:rPr>
           <w:i/>
-          <w:sz w:val="22"/>
+          <w:sz w:val="21"/>
         </w:rPr>
-        <w:t>(Draf Naskah Bab III Metodologi Penelitian dan Bab IV Hasil &amp; Pembahasan)</w:t>
+        <w:t>Rujukan Ilmiah: Jurnal Teknik Informatika (JUTIF) Vol. 6, No. 6, Desember 2025</w:t>
+        <w:br/>
+        <w:t>Penulis: Chalifa Chazar, Aditya Nugraha (Institut Teknologi Nasional Bandung)</w:t>
+        <w:br/>
+        <w:t>DOI: https://doi.org/10.52436/1.jutif.6.6.3540</w:t>
       </w:r>
     </w:p>
     <w:p>
@@ -65,7 +69,7 @@
         <w:jc w:val="both"/>
       </w:pPr>
       <w:r>
-        <w:t>Sistem yang dirancang dalam penelitian ini adalah sistem cerdas penghitungan volume lalu lintas multi-kelas pada kondisi cuaca buruk (adverse weather conditions), khususnya kondisi hujan lebat, secara nir-duplikasi (zero duplicate count). Sistem ini mengintegrasikan model deteksi objek DEYOLO (Dual-Input Enhanced YOLO) berbasis citra RGB dan Pseudo-Infrared (Pseudo-IR) dengan algoritma Multi-Object Tracking ByteTrack serta modul garis hitung virtual berbasis pemisah lajur (Split-Lane Dual-Tripwire).</w:t>
+        <w:t>Sistem yang dirancang dalam penelitian ini adalah sistem cerdas penghitungan volume lalu lintas multi-kelas (car, bus, truck) pada kondisi cuaca buruk (adverse weather), khususnya kondisi hujan lebat di jalan tol. Sistem ini mengintegrasikan model deteksi objek DEYOLO (Dual-Feature Enhancement YOLO) berbasis citra RGB dan Pseudo-Infrared (Pseudo-IR) dengan algoritma Multi-Object Tracking (MOT) ByteTrack serta modul garis hitung virtual berbasis pemisah lajur (Split-Lane Dual-Tripwire).</w:t>
       </w:r>
     </w:p>
     <w:p>
@@ -74,7 +78,7 @@
         <w:jc w:val="both"/>
       </w:pPr>
       <w:r>
-        <w:t>Arsitektur alur kerja sistem terdiri atas empat tahapan utama, yaitu: (1) Prapemrosesan citra dan ekstraksi Pseudo-IR Sobel, (2) Inferensi deteksi tensor ganda DEYOLO, (3) Estimasi trajektori dan asosiasi dua tahap ByteTrack dengan Kalman Filter 8-dimensi, serta (4) Evaluasi penyeberangan garis virtual Split-Lane Tripwire yang dilengkapi filter anti-duplikasi dan pencatatan log data otomatis ke format CSV.</w:t>
+        <w:t>Arsitektur alur kerja sistem terdiri atas empat tahapan utama: (1) Prapemrosesan citra sintetis Pseudo-IR (Sobel Edge dan CLAHE), (2) Ekstraksi fitur dan fusi atensi ganda DECA (Dual-Enhancement Channel Attention) serta DEPA (Dual-Enhancement Position Attention) pada DEYOLO, (3) Estimasi pergerakan spasial dan asosiasi dua tahap menggunakan ByteTrack dengan Kalman Filter 8-dimensi, serta (4) Evaluasi penyeberangan garis virtual Split-Lane Tripwire yang dilengkapi filter anti-duplikasi dan pencatatan log data otomatis ke format CSV.</w:t>
       </w:r>
     </w:p>
     <w:p>
@@ -85,7 +89,7 @@
         <w:rPr>
           <w:b/>
         </w:rPr>
-        <w:t>3.2 Prapemrosesan Citra: Generator Pseudo-Infrared (Pseudo-IR)</w:t>
+        <w:t>3.2 Dataset dan Anotasi (Dataset and Annotation)</w:t>
       </w:r>
     </w:p>
     <w:p>
@@ -94,51 +98,580 @@
         <w:jc w:val="both"/>
       </w:pPr>
       <w:r>
-        <w:t>Kondisi hujan lebat menimbulkan gangguan visual berupa pembiasan tetesan air pada kaca/lensa, pantulan lampu pada aspal basah (glare), dan kabut air (spray) yang menurunkan kontras tepi kendaraan. Untuk memitigasi kendala ini, citra masukan RGB ditransformasikan menjadi representasi Pseudo-Infrared bergradien tajam menggunakan operator diferensial Sobel.</w:t>
+        <w:t>Dataset penelitian dibangun dari rekaman video CCTV jalan tol pada kondisi cuaca hujan siang hari. Tiga klip video mentah, masing-masing berdurasi sekitar 5 menit, diekstraksi dengan laju pengambilan sampel tetap 3 frame per detik (3 FPS). Total frame yang dianotasi adalah sebanyak 2.764 frame yang dibagi ke dalam tiga subset (Train, Validation, Testing) secara independen untuk memastikan evaluasi objektif pada kondisi rekaman yang belum pernah dilihat model (unseen conditions). Distribusi dataset disajikan pada Tabel 3.1.</w:t>
       </w:r>
     </w:p>
     <w:p>
       <w:pPr>
-        <w:ind w:firstLine="576"/>
-      </w:pPr>
-      <w:r>
-        <w:t>Tahapan matematis pembentukan citra Pseudo-IR didefinisikan sebagai berikut:</w:t>
-      </w:r>
-    </w:p>
-    <w:p>
-      <w:pPr>
-        <w:spacing w:after="160"/>
-        <w:jc w:val="center"/>
+        <w:spacing w:after="80"/>
       </w:pPr>
       <w:r>
         <w:rPr>
-          <w:rFonts w:ascii="Consolas" w:hAnsi="Consolas"/>
-          <w:sz w:val="21"/>
+          <w:b/>
         </w:rPr>
-        <w:t>1. Penghalusan Gaussian:</w:t>
-        <w:br/>
-        <w:t>I_blur(x, y) = I_gray(x, y) * G_sigma(x, y),  dengan sigma = 2.0</w:t>
-        <w:br/>
-        <w:br/>
-        <w:t>2. Konvolusi Gradien Spasial Sobel:</w:t>
-        <w:br/>
-        <w:t>G_x(x, y) = I_blur(x, y) * S_x,     G_y(x, y) = I_blur(x, y) * S_y</w:t>
-        <w:br/>
-        <w:br/>
-        <w:t>3. Magnitudo Gradien dan Normalisasi:</w:t>
-        <w:br/>
-        <w:t>Magnitude(x, y) = sqrt(G_x(x, y)^2 + G_y(x, y)^2)</w:t>
-        <w:br/>
-        <w:t>I_Pseudo-IR(x, y) = floor(((Magnitude - min(Magnitude)) / (max(Magnitude) - min(Magnitude))) * 255)</w:t>
+        <w:t>Tabel 3.1 Distribusi Citra dan Jumlah Instance Objek per Kelas pada Dataset</w:t>
       </w:r>
     </w:p>
+    <w:tbl>
+      <w:tblPr>
+        <w:tblW w:type="auto" w:w="0"/>
+        <w:jc w:val="center"/>
+        <w:tblLook w:firstColumn="1" w:firstRow="1" w:lastColumn="0" w:lastRow="0" w:noHBand="0" w:noVBand="1" w:val="04A0"/>
+      </w:tblPr>
+      <w:tblGrid>
+        <w:gridCol w:w="1380"/>
+        <w:gridCol w:w="1380"/>
+        <w:gridCol w:w="1380"/>
+        <w:gridCol w:w="1380"/>
+        <w:gridCol w:w="1380"/>
+        <w:gridCol w:w="1380"/>
+      </w:tblGrid>
+      <w:tr>
+        <w:tc>
+          <w:tcPr>
+            <w:tcW w:type="dxa" w:w="1380"/>
+            <w:tcMar>
+              <w:top w:w="70" w:type="dxa"/>
+              <w:bottom w:w="70" w:type="dxa"/>
+              <w:left w:w="90" w:type="dxa"/>
+              <w:right w:w="90" w:type="dxa"/>
+            </w:tcMar>
+            <w:shd w:val="clear" w:color="auto" w:fill="E8EEF5"/>
+          </w:tcPr>
+          <w:p>
+            <w:r>
+              <w:rPr>
+                <w:b/>
+              </w:rPr>
+              <w:t>Subset</w:t>
+            </w:r>
+          </w:p>
+        </w:tc>
+        <w:tc>
+          <w:tcPr>
+            <w:tcW w:type="dxa" w:w="1380"/>
+            <w:tcMar>
+              <w:top w:w="70" w:type="dxa"/>
+              <w:bottom w:w="70" w:type="dxa"/>
+              <w:left w:w="90" w:type="dxa"/>
+              <w:right w:w="90" w:type="dxa"/>
+            </w:tcMar>
+            <w:shd w:val="clear" w:color="auto" w:fill="E8EEF5"/>
+          </w:tcPr>
+          <w:p>
+            <w:r>
+              <w:rPr>
+                <w:b/>
+              </w:rPr>
+              <w:t>Jumlah Gambar</w:t>
+            </w:r>
+          </w:p>
+        </w:tc>
+        <w:tc>
+          <w:tcPr>
+            <w:tcW w:type="dxa" w:w="1380"/>
+            <w:tcMar>
+              <w:top w:w="70" w:type="dxa"/>
+              <w:bottom w:w="70" w:type="dxa"/>
+              <w:left w:w="90" w:type="dxa"/>
+              <w:right w:w="90" w:type="dxa"/>
+            </w:tcMar>
+            <w:shd w:val="clear" w:color="auto" w:fill="E8EEF5"/>
+          </w:tcPr>
+          <w:p>
+            <w:r>
+              <w:rPr>
+                <w:b/>
+              </w:rPr>
+              <w:t>Mobil (Car)</w:t>
+            </w:r>
+          </w:p>
+        </w:tc>
+        <w:tc>
+          <w:tcPr>
+            <w:tcW w:type="dxa" w:w="1380"/>
+            <w:tcMar>
+              <w:top w:w="70" w:type="dxa"/>
+              <w:bottom w:w="70" w:type="dxa"/>
+              <w:left w:w="90" w:type="dxa"/>
+              <w:right w:w="90" w:type="dxa"/>
+            </w:tcMar>
+            <w:shd w:val="clear" w:color="auto" w:fill="E8EEF5"/>
+          </w:tcPr>
+          <w:p>
+            <w:r>
+              <w:rPr>
+                <w:b/>
+              </w:rPr>
+              <w:t>Bus (Bus)</w:t>
+            </w:r>
+          </w:p>
+        </w:tc>
+        <w:tc>
+          <w:tcPr>
+            <w:tcW w:type="dxa" w:w="1380"/>
+            <w:tcMar>
+              <w:top w:w="70" w:type="dxa"/>
+              <w:bottom w:w="70" w:type="dxa"/>
+              <w:left w:w="90" w:type="dxa"/>
+              <w:right w:w="90" w:type="dxa"/>
+            </w:tcMar>
+            <w:shd w:val="clear" w:color="auto" w:fill="E8EEF5"/>
+          </w:tcPr>
+          <w:p>
+            <w:r>
+              <w:rPr>
+                <w:b/>
+              </w:rPr>
+              <w:t>Truk (Truck)</w:t>
+            </w:r>
+          </w:p>
+        </w:tc>
+        <w:tc>
+          <w:tcPr>
+            <w:tcW w:type="dxa" w:w="1380"/>
+            <w:tcMar>
+              <w:top w:w="70" w:type="dxa"/>
+              <w:bottom w:w="70" w:type="dxa"/>
+              <w:left w:w="90" w:type="dxa"/>
+              <w:right w:w="90" w:type="dxa"/>
+            </w:tcMar>
+            <w:shd w:val="clear" w:color="auto" w:fill="E8EEF5"/>
+          </w:tcPr>
+          <w:p>
+            <w:r>
+              <w:rPr>
+                <w:b/>
+              </w:rPr>
+              <w:t>Total Instance</w:t>
+            </w:r>
+          </w:p>
+        </w:tc>
+      </w:tr>
+      <w:tr>
+        <w:tc>
+          <w:tcPr>
+            <w:tcW w:type="dxa" w:w="1380"/>
+            <w:tcMar>
+              <w:top w:w="70" w:type="dxa"/>
+              <w:bottom w:w="70" w:type="dxa"/>
+              <w:left w:w="90" w:type="dxa"/>
+              <w:right w:w="90" w:type="dxa"/>
+            </w:tcMar>
+          </w:tcPr>
+          <w:p>
+            <w:r>
+              <w:t>Train (Pelatihan)</w:t>
+            </w:r>
+          </w:p>
+        </w:tc>
+        <w:tc>
+          <w:tcPr>
+            <w:tcW w:type="dxa" w:w="1380"/>
+            <w:tcMar>
+              <w:top w:w="70" w:type="dxa"/>
+              <w:bottom w:w="70" w:type="dxa"/>
+              <w:left w:w="90" w:type="dxa"/>
+              <w:right w:w="90" w:type="dxa"/>
+            </w:tcMar>
+          </w:tcPr>
+          <w:p>
+            <w:r>
+              <w:t>2.389</w:t>
+            </w:r>
+          </w:p>
+        </w:tc>
+        <w:tc>
+          <w:tcPr>
+            <w:tcW w:type="dxa" w:w="1380"/>
+            <w:tcMar>
+              <w:top w:w="70" w:type="dxa"/>
+              <w:bottom w:w="70" w:type="dxa"/>
+              <w:left w:w="90" w:type="dxa"/>
+              <w:right w:w="90" w:type="dxa"/>
+            </w:tcMar>
+          </w:tcPr>
+          <w:p>
+            <w:r>
+              <w:t>7.858</w:t>
+            </w:r>
+          </w:p>
+        </w:tc>
+        <w:tc>
+          <w:tcPr>
+            <w:tcW w:type="dxa" w:w="1380"/>
+            <w:tcMar>
+              <w:top w:w="70" w:type="dxa"/>
+              <w:bottom w:w="70" w:type="dxa"/>
+              <w:left w:w="90" w:type="dxa"/>
+              <w:right w:w="90" w:type="dxa"/>
+            </w:tcMar>
+          </w:tcPr>
+          <w:p>
+            <w:r>
+              <w:t>451</w:t>
+            </w:r>
+          </w:p>
+        </w:tc>
+        <w:tc>
+          <w:tcPr>
+            <w:tcW w:type="dxa" w:w="1380"/>
+            <w:tcMar>
+              <w:top w:w="70" w:type="dxa"/>
+              <w:bottom w:w="70" w:type="dxa"/>
+              <w:left w:w="90" w:type="dxa"/>
+              <w:right w:w="90" w:type="dxa"/>
+            </w:tcMar>
+          </w:tcPr>
+          <w:p>
+            <w:r>
+              <w:t>2.614</w:t>
+            </w:r>
+          </w:p>
+        </w:tc>
+        <w:tc>
+          <w:tcPr>
+            <w:tcW w:type="dxa" w:w="1380"/>
+            <w:tcMar>
+              <w:top w:w="70" w:type="dxa"/>
+              <w:bottom w:w="70" w:type="dxa"/>
+              <w:left w:w="90" w:type="dxa"/>
+              <w:right w:w="90" w:type="dxa"/>
+            </w:tcMar>
+          </w:tcPr>
+          <w:p>
+            <w:r>
+              <w:t>10.923</w:t>
+            </w:r>
+          </w:p>
+        </w:tc>
+      </w:tr>
+      <w:tr>
+        <w:tc>
+          <w:tcPr>
+            <w:tcW w:type="dxa" w:w="1380"/>
+            <w:tcMar>
+              <w:top w:w="70" w:type="dxa"/>
+              <w:bottom w:w="70" w:type="dxa"/>
+              <w:left w:w="90" w:type="dxa"/>
+              <w:right w:w="90" w:type="dxa"/>
+            </w:tcMar>
+          </w:tcPr>
+          <w:p>
+            <w:r>
+              <w:t>Validation (Validasi)</w:t>
+            </w:r>
+          </w:p>
+        </w:tc>
+        <w:tc>
+          <w:tcPr>
+            <w:tcW w:type="dxa" w:w="1380"/>
+            <w:tcMar>
+              <w:top w:w="70" w:type="dxa"/>
+              <w:bottom w:w="70" w:type="dxa"/>
+              <w:left w:w="90" w:type="dxa"/>
+              <w:right w:w="90" w:type="dxa"/>
+            </w:tcMar>
+          </w:tcPr>
+          <w:p>
+            <w:r>
+              <w:t>316</w:t>
+            </w:r>
+          </w:p>
+        </w:tc>
+        <w:tc>
+          <w:tcPr>
+            <w:tcW w:type="dxa" w:w="1380"/>
+            <w:tcMar>
+              <w:top w:w="70" w:type="dxa"/>
+              <w:bottom w:w="70" w:type="dxa"/>
+              <w:left w:w="90" w:type="dxa"/>
+              <w:right w:w="90" w:type="dxa"/>
+            </w:tcMar>
+          </w:tcPr>
+          <w:p>
+            <w:r>
+              <w:t>744</w:t>
+            </w:r>
+          </w:p>
+        </w:tc>
+        <w:tc>
+          <w:tcPr>
+            <w:tcW w:type="dxa" w:w="1380"/>
+            <w:tcMar>
+              <w:top w:w="70" w:type="dxa"/>
+              <w:bottom w:w="70" w:type="dxa"/>
+              <w:left w:w="90" w:type="dxa"/>
+              <w:right w:w="90" w:type="dxa"/>
+            </w:tcMar>
+          </w:tcPr>
+          <w:p>
+            <w:r>
+              <w:t>72</w:t>
+            </w:r>
+          </w:p>
+        </w:tc>
+        <w:tc>
+          <w:tcPr>
+            <w:tcW w:type="dxa" w:w="1380"/>
+            <w:tcMar>
+              <w:top w:w="70" w:type="dxa"/>
+              <w:bottom w:w="70" w:type="dxa"/>
+              <w:left w:w="90" w:type="dxa"/>
+              <w:right w:w="90" w:type="dxa"/>
+            </w:tcMar>
+          </w:tcPr>
+          <w:p>
+            <w:r>
+              <w:t>270</w:t>
+            </w:r>
+          </w:p>
+        </w:tc>
+        <w:tc>
+          <w:tcPr>
+            <w:tcW w:type="dxa" w:w="1380"/>
+            <w:tcMar>
+              <w:top w:w="70" w:type="dxa"/>
+              <w:bottom w:w="70" w:type="dxa"/>
+              <w:left w:w="90" w:type="dxa"/>
+              <w:right w:w="90" w:type="dxa"/>
+            </w:tcMar>
+          </w:tcPr>
+          <w:p>
+            <w:r>
+              <w:t>1.086</w:t>
+            </w:r>
+          </w:p>
+        </w:tc>
+      </w:tr>
+      <w:tr>
+        <w:tc>
+          <w:tcPr>
+            <w:tcW w:type="dxa" w:w="1380"/>
+            <w:tcMar>
+              <w:top w:w="70" w:type="dxa"/>
+              <w:bottom w:w="70" w:type="dxa"/>
+              <w:left w:w="90" w:type="dxa"/>
+              <w:right w:w="90" w:type="dxa"/>
+            </w:tcMar>
+          </w:tcPr>
+          <w:p>
+            <w:r>
+              <w:t>Testing (Pengujian)</w:t>
+            </w:r>
+          </w:p>
+        </w:tc>
+        <w:tc>
+          <w:tcPr>
+            <w:tcW w:type="dxa" w:w="1380"/>
+            <w:tcMar>
+              <w:top w:w="70" w:type="dxa"/>
+              <w:bottom w:w="70" w:type="dxa"/>
+              <w:left w:w="90" w:type="dxa"/>
+              <w:right w:w="90" w:type="dxa"/>
+            </w:tcMar>
+          </w:tcPr>
+          <w:p>
+            <w:r>
+              <w:t>59</w:t>
+            </w:r>
+          </w:p>
+        </w:tc>
+        <w:tc>
+          <w:tcPr>
+            <w:tcW w:type="dxa" w:w="1380"/>
+            <w:tcMar>
+              <w:top w:w="70" w:type="dxa"/>
+              <w:bottom w:w="70" w:type="dxa"/>
+              <w:left w:w="90" w:type="dxa"/>
+              <w:right w:w="90" w:type="dxa"/>
+            </w:tcMar>
+          </w:tcPr>
+          <w:p>
+            <w:r>
+              <w:t>147</w:t>
+            </w:r>
+          </w:p>
+        </w:tc>
+        <w:tc>
+          <w:tcPr>
+            <w:tcW w:type="dxa" w:w="1380"/>
+            <w:tcMar>
+              <w:top w:w="70" w:type="dxa"/>
+              <w:bottom w:w="70" w:type="dxa"/>
+              <w:left w:w="90" w:type="dxa"/>
+              <w:right w:w="90" w:type="dxa"/>
+            </w:tcMar>
+          </w:tcPr>
+          <w:p>
+            <w:r>
+              <w:t>18</w:t>
+            </w:r>
+          </w:p>
+        </w:tc>
+        <w:tc>
+          <w:tcPr>
+            <w:tcW w:type="dxa" w:w="1380"/>
+            <w:tcMar>
+              <w:top w:w="70" w:type="dxa"/>
+              <w:bottom w:w="70" w:type="dxa"/>
+              <w:left w:w="90" w:type="dxa"/>
+              <w:right w:w="90" w:type="dxa"/>
+            </w:tcMar>
+          </w:tcPr>
+          <w:p>
+            <w:r>
+              <w:t>48</w:t>
+            </w:r>
+          </w:p>
+        </w:tc>
+        <w:tc>
+          <w:tcPr>
+            <w:tcW w:type="dxa" w:w="1380"/>
+            <w:tcMar>
+              <w:top w:w="70" w:type="dxa"/>
+              <w:bottom w:w="70" w:type="dxa"/>
+              <w:left w:w="90" w:type="dxa"/>
+              <w:right w:w="90" w:type="dxa"/>
+            </w:tcMar>
+          </w:tcPr>
+          <w:p>
+            <w:r>
+              <w:t>213</w:t>
+            </w:r>
+          </w:p>
+        </w:tc>
+      </w:tr>
+      <w:tr>
+        <w:tc>
+          <w:tcPr>
+            <w:tcW w:type="dxa" w:w="1380"/>
+            <w:tcMar>
+              <w:top w:w="70" w:type="dxa"/>
+              <w:bottom w:w="70" w:type="dxa"/>
+              <w:left w:w="90" w:type="dxa"/>
+              <w:right w:w="90" w:type="dxa"/>
+            </w:tcMar>
+            <w:shd w:val="clear" w:color="auto" w:fill="F2F4F7"/>
+          </w:tcPr>
+          <w:p>
+            <w:r>
+              <w:rPr>
+                <w:b/>
+              </w:rPr>
+              <w:t>TOTAL DATASET</w:t>
+            </w:r>
+          </w:p>
+        </w:tc>
+        <w:tc>
+          <w:tcPr>
+            <w:tcW w:type="dxa" w:w="1380"/>
+            <w:tcMar>
+              <w:top w:w="70" w:type="dxa"/>
+              <w:bottom w:w="70" w:type="dxa"/>
+              <w:left w:w="90" w:type="dxa"/>
+              <w:right w:w="90" w:type="dxa"/>
+            </w:tcMar>
+            <w:shd w:val="clear" w:color="auto" w:fill="F2F4F7"/>
+          </w:tcPr>
+          <w:p>
+            <w:r>
+              <w:rPr>
+                <w:b/>
+              </w:rPr>
+              <w:t>2.764</w:t>
+            </w:r>
+          </w:p>
+        </w:tc>
+        <w:tc>
+          <w:tcPr>
+            <w:tcW w:type="dxa" w:w="1380"/>
+            <w:tcMar>
+              <w:top w:w="70" w:type="dxa"/>
+              <w:bottom w:w="70" w:type="dxa"/>
+              <w:left w:w="90" w:type="dxa"/>
+              <w:right w:w="90" w:type="dxa"/>
+            </w:tcMar>
+            <w:shd w:val="clear" w:color="auto" w:fill="F2F4F7"/>
+          </w:tcPr>
+          <w:p>
+            <w:r>
+              <w:rPr>
+                <w:b/>
+              </w:rPr>
+              <w:t>8.749</w:t>
+            </w:r>
+          </w:p>
+        </w:tc>
+        <w:tc>
+          <w:tcPr>
+            <w:tcW w:type="dxa" w:w="1380"/>
+            <w:tcMar>
+              <w:top w:w="70" w:type="dxa"/>
+              <w:bottom w:w="70" w:type="dxa"/>
+              <w:left w:w="90" w:type="dxa"/>
+              <w:right w:w="90" w:type="dxa"/>
+            </w:tcMar>
+            <w:shd w:val="clear" w:color="auto" w:fill="F2F4F7"/>
+          </w:tcPr>
+          <w:p>
+            <w:r>
+              <w:rPr>
+                <w:b/>
+              </w:rPr>
+              <w:t>541</w:t>
+            </w:r>
+          </w:p>
+        </w:tc>
+        <w:tc>
+          <w:tcPr>
+            <w:tcW w:type="dxa" w:w="1380"/>
+            <w:tcMar>
+              <w:top w:w="70" w:type="dxa"/>
+              <w:bottom w:w="70" w:type="dxa"/>
+              <w:left w:w="90" w:type="dxa"/>
+              <w:right w:w="90" w:type="dxa"/>
+            </w:tcMar>
+            <w:shd w:val="clear" w:color="auto" w:fill="F2F4F7"/>
+          </w:tcPr>
+          <w:p>
+            <w:r>
+              <w:rPr>
+                <w:b/>
+              </w:rPr>
+              <w:t>2.932</w:t>
+            </w:r>
+          </w:p>
+        </w:tc>
+        <w:tc>
+          <w:tcPr>
+            <w:tcW w:type="dxa" w:w="1380"/>
+            <w:tcMar>
+              <w:top w:w="70" w:type="dxa"/>
+              <w:bottom w:w="70" w:type="dxa"/>
+              <w:left w:w="90" w:type="dxa"/>
+              <w:right w:w="90" w:type="dxa"/>
+            </w:tcMar>
+            <w:shd w:val="clear" w:color="auto" w:fill="F2F4F7"/>
+          </w:tcPr>
+          <w:p>
+            <w:r>
+              <w:rPr>
+                <w:b/>
+              </w:rPr>
+              <w:t>12.222</w:t>
+            </w:r>
+          </w:p>
+        </w:tc>
+      </w:tr>
+    </w:tbl>
     <w:p>
       <w:pPr>
         <w:ind w:firstLine="576"/>
         <w:jc w:val="both"/>
       </w:pPr>
       <w:r>
-        <w:t>Citra Pseudo-IR hasil normalisasi kemudian digabungkan bersama kanal RGB asli menjadi pasangan tensor masukan ganda pada arsitektur DEYOLO, sehingga jaringan dapat mengekstraksi informasi batas geometris kendaraan secara optimal.</w:t>
+        <w:t>Seluruh anotasi kotak pembatas (bounding box) dihasilkan menggunakan Computer Vision Annotation Tool (CVAT) dengan metode interpolasi antar-frame, kemudian diekspor ke format standar label YOLO.</w:t>
       </w:r>
     </w:p>
     <w:p>
@@ -149,19 +682,7 @@
         <w:rPr>
           <w:b/>
         </w:rPr>
-        <w:t>3.3 Pemodelan Multi-Object Tracking (ByteTrack)</w:t>
-      </w:r>
-    </w:p>
-    <w:p>
-      <w:pPr>
-        <w:spacing w:after="80"/>
-      </w:pPr>
-      <w:r>
-        <w:rPr>
-          <w:b/>
-          <w:i/>
-        </w:rPr>
-        <w:t>3.3.1 Ruang Keadaan Kalman Filter 8-Dimensi</w:t>
+        <w:t>3.3 Prapemrosesan Citra: Sintesis Modalitas Pseudo-Infrared (Pseudo-IR)</w:t>
       </w:r>
     </w:p>
     <w:p>
@@ -170,72 +691,28 @@
         <w:jc w:val="both"/>
       </w:pPr>
       <w:r>
-        <w:t>Untuk memprediksi posisi dan mempertahankan kontinuitas objek yang terlacak antar-frame, ByteTrack menerapkan Filter Kalman linier dengan vektor keadaan fisik 8-dimensi:</w:t>
-      </w:r>
-    </w:p>
-    <w:p>
-      <w:pPr>
-        <w:spacing w:after="160"/>
-        <w:jc w:val="center"/>
-      </w:pPr>
-      <w:r>
-        <w:rPr>
-          <w:rFonts w:ascii="Consolas" w:hAnsi="Consolas"/>
-          <w:sz w:val="21"/>
-        </w:rPr>
-        <w:t>x = [x_c, y_c, a, h, v_xc, v_yc, v_a, v_h]^T</w:t>
-        <w:br/>
-        <w:br/>
-        <w:t>Prediksi Keadaan:  x^(t|t-1) = F * x(t-1|t-1)</w:t>
-        <w:br/>
-        <w:t>Prediksi Kovarian: P^(t|t-1) = F * P(t-1|t-1) * F^T + Q</w:t>
-        <w:br/>
-        <w:t>Kalman Gain:       K_t = P^(t|t-1) * H^T * (H * P^(t|t-1) * H^T + R)^(-1)</w:t>
-        <w:br/>
-        <w:t>Pembaruan Keadaan: x(t|t) = x^(t|t-1) + K_t * (z_t - H * x^(t|t-1))</w:t>
-        <w:br/>
-        <w:t>Pembaruan Kovarian:P(t|t) = (I - K_t * H) * P^(t|t-1)</w:t>
+        <w:t>Kondisi hujan lebat menimbulkan gangguan visual berupa garis hujan vertikal (rain streaks), cipratan air roda kendaraan (spray), dan pantulan lampu pada aspal basah (specular reflections). Untuk mengatasi ketiadaan sensor inframerah termal fisik, modalitas sintetis Pseudo-IR dibentuk melalui dua metode prapemrosesan:</w:t>
       </w:r>
     </w:p>
     <w:p>
       <w:pPr>
         <w:ind w:firstLine="576"/>
-        <w:jc w:val="both"/>
       </w:pPr>
       <w:r>
-        <w:t>di mana (x_c, y_c) merepresentasikan koordinat titik tengah kotak pembatas, a adalah rasio aspek lebar terhadap tinggi (w/h), h adalah tinggi kotak pembatas dalam piksel, dan (v_xc, v_yc, v_a, v_h) adalah turunan kecepatan linier masing-masing komponen.</w:t>
-      </w:r>
-    </w:p>
-    <w:p>
-      <w:pPr>
-        <w:spacing w:after="80"/>
-      </w:pPr>
-      <w:r>
-        <w:rPr>
-          <w:b/>
-          <w:i/>
-        </w:rPr>
-        <w:t>3.3.2 Asosiasi Data Dua Tahap (Two-Stage Association)</w:t>
-      </w:r>
-    </w:p>
-    <w:p>
-      <w:pPr>
-        <w:ind w:firstLine="576"/>
-        <w:jc w:val="both"/>
-      </w:pPr>
-      <w:r>
-        <w:t>Keunggulan utama ByteTrack dibandingkan tracker konvensional adalah kemampuannya memanfaatkan kotak deteksi berkepercayaan rendah (low-confidence boxes) yang kerap timbul saat kendaraan tertutup hujan atau oklusi parsial:</w:t>
-      </w:r>
-    </w:p>
-    <w:p>
-      <w:pPr>
-        <w:ind w:firstLine="576"/>
-        <w:jc w:val="both"/>
-      </w:pPr>
-      <w:r>
-        <w:t>1. Tahap Pertama (High-Score Matching): Deteksi dengan skor kepercayaan tinggi (D_high &gt;= 0.40) dipasangkan dengan himpunan track yang ada menggunakan matriks jarak 1 - IoU dan Algoritma Hungarian.</w:t>
+        <w:t>1. Varian Sobel Edge (Sintesis Utama - EXP-05):</w:t>
         <w:br/>
-        <w:t>2. Tahap Kedua (Low-Score Recovery Matching): Deteksi dengan skor kepercayaan rendah (0.10 &lt;= D_low &lt; 0.40) dicocokkan dengan sisa track yang belum terpasang pada tahap pertama. Hal ini mencegah putusnya identitas pelacakan (ID retention).</w:t>
+        <w:t xml:space="preserve">   Citra RGB dikonversi ke skala abu-abu I_gray, dihaluskan dengan Gaussian Blur (sigma = 2.0) untuk mereduksi derau frekuensi tinggi, lalu diekstraksi gradien tepi horizontal dan vertikal menggunakan kernel Sobel 3x3:</w:t>
+        <w:br/>
+        <w:t xml:space="preserve">   G_x = I_blur * S_x,    G_y = I_blur * S_y</w:t>
+        <w:br/>
+        <w:t xml:space="preserve">   Magnitude(x, y) = sqrt(G_x^2 + G_y^2)</w:t>
+        <w:br/>
+        <w:t xml:space="preserve">   Hasil magnitudo dinormalisasi ke rentang 8-bit [0, 255] dan direplikasi menjadi 3 kanal identik.</w:t>
+        <w:br/>
+        <w:br/>
+        <w:t>2. Varian CLAHE + Sobel (Sintesis Peningkatan Kontras - EXP-07):</w:t>
+        <w:br/>
+        <w:t xml:space="preserve">   Menerapkan Contrast Limited Adaptive Histogram Equalization (clip limit = 2.0, tile grid = 8x8) pada citra skala abu-abu sebelum penghalusan Gaussian ringan (kernel 5x5, sigma = 1.0) dan ekstraksi gradien Sobel 3x3.</w:t>
       </w:r>
     </w:p>
     <w:p>
@@ -246,7 +723,7 @@
         <w:rPr>
           <w:b/>
         </w:rPr>
-        <w:t>3.4 Perancangan Garis Hitung Virtual (Split-Lane Dual-Tripwire)</w:t>
+        <w:t>3.4 Arsitektur Dual Feature Enhancement YOLO (DEYOLO)</w:t>
       </w:r>
     </w:p>
     <w:p>
@@ -255,7 +732,37 @@
         <w:jc w:val="both"/>
       </w:pPr>
       <w:r>
-        <w:t>Untuk mengakomodasi geometri jalan tol dua arah dengan sudut kamera miring (oblique perspective), garis hitung virtual dirancang dengan pendekatan Split-Lane Dual-Tripwire:</w:t>
+        <w:t>Model DEYOLO menggunakan arsitektur backbone ganda (dual-stream backbone) bergaya YOLOv8n untuk memproses citra RGB (Visible/VI) dan Pseudo-IR secara paralel. Fusi lintas modalitas dilakukan oleh modul Dual-Enhancement Attention (DEA) yang menggabungkan dua sub-modul berurutan:</w:t>
+      </w:r>
+    </w:p>
+    <w:p>
+      <w:pPr>
+        <w:ind w:firstLine="576"/>
+      </w:pPr>
+      <w:r>
+        <w:t>• Dual-Enhancement Channel Attention (DECA):</w:t>
+        <w:br/>
+        <w:t xml:space="preserve">  Melakukan pembobotan kanal silang (cross-channel gating). Deskriptor kanal masing-masing modalitas (W_vi dan W_ir) dihitung melalui Global Average Pooling dan dua lapisan Fully-Connected dengan rasio reduksi r, lalu digabungkan dengan konteks global G:</w:t>
+        <w:br/>
+        <w:t xml:space="preserve">  F_vi' = F_vi ⊙ sigma(W_ir ⊙ G)</w:t>
+        <w:br/>
+        <w:t xml:space="preserve">  F_ir' = F_ir ⊙ sigma(W_vi ⊙ G)</w:t>
+        <w:br/>
+        <w:br/>
+        <w:t>• Dual-Enhancement Position Attention (DEPA):</w:t>
+        <w:br/>
+        <w:t xml:space="preserve">  Melakukan pembobotan spasial silang (cross-spatial gating) pada tingkat piksel menggunakan konvolusi multi-kernel simetris 3x3 yang terbukti lebih efektif mereduksi derau garis hujan vertikal dibandingkan kernel asimetris 3x7.</w:t>
+      </w:r>
+    </w:p>
+    <w:p>
+      <w:pPr>
+        <w:spacing w:after="120"/>
+      </w:pPr>
+      <w:r>
+        <w:rPr>
+          <w:b/>
+        </w:rPr>
+        <w:t>3.5 Multi-Object Tracking (ByteTrack) dan Split-Lane Tripwire</w:t>
       </w:r>
     </w:p>
     <w:p>
@@ -264,13 +771,24 @@
         <w:jc w:val="both"/>
       </w:pPr>
       <w:r>
-        <w:t>• Lajur Kiri (Arus Keluar / OUT / Ke Atas): Garis tripwire diletakkan pada rasio Y_left = 0.70 dari tinggi frame (posisi lebih bawah). Posisi ini memberikan ruang transisi bagi kendaraan yang baru memasuki batas pandang kamera dari bawah untuk diinisialisasi secara stabil sebelum menyentuh garis.</w:t>
+        <w:t>Untuk pelacakan objek jamak, ByteTrack memodelkan dinamika fisik pergerakan kendaraan menggunakan Kalman Filter 8-keadaan [x_c, y_c, a, h, v_xc, v_yc, v_a, v_h]^T dan mekanisme asosiasi dua tahap (two-stage association). Kotak deteksi berkepercayaan rendah (0.10 &lt;= conf &lt; 0.40) tetap dipertahankan untuk memulihkan track kendaraan yang terhalang oklusi hujan.</w:t>
+      </w:r>
+    </w:p>
+    <w:p>
+      <w:pPr>
+        <w:ind w:firstLine="576"/>
+        <w:jc w:val="both"/>
+      </w:pPr>
+      <w:r>
+        <w:t>Penghitungan volume lalu lintas dilakukan melalui garis virtual Split-Lane Tripwire:</w:t>
         <w:br/>
-        <w:t>• Lajur Kanan (Arus Masuk / IN / Ke Bawah): Garis tripwire diletakkan pada rasio Y_right = 0.50 (tengah layar).</w:t>
+        <w:t>• Lajur Kiri (Arah OUT / Keluar / Ke Atas): Garis diletakkan pada rasio Y_left = 0.70 dari tinggi frame.</w:t>
         <w:br/>
-        <w:t>• Garis Pembagi Lajur: Garis vertikal pada X_split = 0.50 yang memisahkan evaluasi lajur kiri dan kanan secara mandiri.</w:t>
+        <w:t>• Lajur Kanan (Arah IN / Masuk / Ke Bawah): Garis diletakkan pada rasio Y_right = 0.50 dari tinggi frame.</w:t>
         <w:br/>
-        <w:t>• Filter Nir-Duplikasi (Anti-Duplicate Filter): Setiap Track ID yang berhasil melintasi garis didaftarkan ke dalam himpunan S_counted. Objek dengan ID yang sama tidak akan pernah memicu penambahan counter untuk kedua kalinya, sehingga probabilitas double-counting bernilai 0%.</w:t>
+        <w:t>• Pembagi Lajur: Garis vertikal X_split = 0.50 memisahkan evaluasi kendaraan secara independen.</w:t>
+        <w:br/>
+        <w:t>• Filter Nir-Duplikasi: Setiap Track ID unik yang menyeberang didaftarkan ke himpunan S_counted sehingga probabilitas double-counting adalah 0%.</w:t>
       </w:r>
     </w:p>
     <w:p>
@@ -301,17 +819,16 @@
         <w:rPr>
           <w:b/>
         </w:rPr>
-        <w:t>4.1 Parameter dan Data Pengujian</w:t>
+        <w:t>4.1 Evaluasi Kinerja Model Deteksi DEYOLO (Rujukan Publikasi JUTIF 2025)</w:t>
       </w:r>
     </w:p>
     <w:p>
       <w:pPr>
-        <w:spacing w:after="240"/>
         <w:ind w:firstLine="576"/>
         <w:jc w:val="both"/>
       </w:pPr>
       <w:r>
-        <w:t>Pengujian performa sistem dilakukan menggunakan rekaman video CCTV jalan tol aktual dalam kondisi cuaca hujan lebat (1138.mp4). Karakteristik metadata video pengujian disajikan pada Tabel 4.1.</w:t>
+        <w:t>Berdasarkan hasil eksperimen ablasi terstruktur pada jurnal rujukan (Chazar &amp; Nugraha, JUTIF 2025), dilakukan perbandingan kinerja antara model Baseline (YOLOv8n) dan enam konfigurasi DEYOLO pada dataset pengujian cuaca hujan. Hasil kuantitatif dirangkum pada Tabel 4.1.</w:t>
       </w:r>
     </w:p>
     <w:p>
@@ -322,7 +839,7 @@
         <w:rPr>
           <w:b/>
         </w:rPr>
-        <w:t>Tabel 4.1 Metadata dan Parameter Video Pengujian</w:t>
+        <w:t>Tabel 4.1 Evaluasi Kinerja Kuantitatif Model Baseline YOLOv8n dan Varian DEYOLO (JUTIF 2025)</w:t>
       </w:r>
     </w:p>
     <w:tbl>
@@ -332,18 +849,22 @@
         <w:tblLook w:firstColumn="1" w:firstRow="1" w:lastColumn="0" w:lastRow="0" w:noHBand="0" w:noVBand="1" w:val="04A0"/>
       </w:tblPr>
       <w:tblGrid>
-        <w:gridCol w:w="4140"/>
-        <w:gridCol w:w="4140"/>
+        <w:gridCol w:w="1380"/>
+        <w:gridCol w:w="1380"/>
+        <w:gridCol w:w="1380"/>
+        <w:gridCol w:w="1380"/>
+        <w:gridCol w:w="1380"/>
+        <w:gridCol w:w="1380"/>
       </w:tblGrid>
       <w:tr>
         <w:tc>
           <w:tcPr>
-            <w:tcW w:type="dxa" w:w="4140"/>
+            <w:tcW w:type="dxa" w:w="1380"/>
             <w:tcMar>
-              <w:top w:w="80" w:type="dxa"/>
-              <w:bottom w:w="80" w:type="dxa"/>
-              <w:left w:w="120" w:type="dxa"/>
-              <w:right w:w="120" w:type="dxa"/>
+              <w:top w:w="70" w:type="dxa"/>
+              <w:bottom w:w="70" w:type="dxa"/>
+              <w:left w:w="80" w:type="dxa"/>
+              <w:right w:w="80" w:type="dxa"/>
             </w:tcMar>
             <w:shd w:val="clear" w:color="auto" w:fill="E8EEF5"/>
           </w:tcPr>
@@ -352,18 +873,18 @@
               <w:rPr>
                 <w:b/>
               </w:rPr>
-              <w:t>Parameter Pengujian</w:t>
+              <w:t>Eksperimen</w:t>
             </w:r>
           </w:p>
         </w:tc>
         <w:tc>
           <w:tcPr>
-            <w:tcW w:type="dxa" w:w="4140"/>
+            <w:tcW w:type="dxa" w:w="1380"/>
             <w:tcMar>
-              <w:top w:w="80" w:type="dxa"/>
-              <w:bottom w:w="80" w:type="dxa"/>
-              <w:left w:w="120" w:type="dxa"/>
-              <w:right w:w="120" w:type="dxa"/>
+              <w:top w:w="70" w:type="dxa"/>
+              <w:bottom w:w="70" w:type="dxa"/>
+              <w:left w:w="80" w:type="dxa"/>
+              <w:right w:w="80" w:type="dxa"/>
             </w:tcMar>
             <w:shd w:val="clear" w:color="auto" w:fill="E8EEF5"/>
           </w:tcPr>
@@ -372,7 +893,87 @@
               <w:rPr>
                 <w:b/>
               </w:rPr>
-              <w:t>Nilai / Spesifikasi</w:t>
+              <w:t>Konfigurasi Arsitektur Model</w:t>
+            </w:r>
+          </w:p>
+        </w:tc>
+        <w:tc>
+          <w:tcPr>
+            <w:tcW w:type="dxa" w:w="1380"/>
+            <w:tcMar>
+              <w:top w:w="70" w:type="dxa"/>
+              <w:bottom w:w="70" w:type="dxa"/>
+              <w:left w:w="80" w:type="dxa"/>
+              <w:right w:w="80" w:type="dxa"/>
+            </w:tcMar>
+            <w:shd w:val="clear" w:color="auto" w:fill="E8EEF5"/>
+          </w:tcPr>
+          <w:p>
+            <w:r>
+              <w:rPr>
+                <w:b/>
+              </w:rPr>
+              <w:t>Precision (%)</w:t>
+            </w:r>
+          </w:p>
+        </w:tc>
+        <w:tc>
+          <w:tcPr>
+            <w:tcW w:type="dxa" w:w="1380"/>
+            <w:tcMar>
+              <w:top w:w="70" w:type="dxa"/>
+              <w:bottom w:w="70" w:type="dxa"/>
+              <w:left w:w="80" w:type="dxa"/>
+              <w:right w:w="80" w:type="dxa"/>
+            </w:tcMar>
+            <w:shd w:val="clear" w:color="auto" w:fill="E8EEF5"/>
+          </w:tcPr>
+          <w:p>
+            <w:r>
+              <w:rPr>
+                <w:b/>
+              </w:rPr>
+              <w:t>Recall (%)</w:t>
+            </w:r>
+          </w:p>
+        </w:tc>
+        <w:tc>
+          <w:tcPr>
+            <w:tcW w:type="dxa" w:w="1380"/>
+            <w:tcMar>
+              <w:top w:w="70" w:type="dxa"/>
+              <w:bottom w:w="70" w:type="dxa"/>
+              <w:left w:w="80" w:type="dxa"/>
+              <w:right w:w="80" w:type="dxa"/>
+            </w:tcMar>
+            <w:shd w:val="clear" w:color="auto" w:fill="E8EEF5"/>
+          </w:tcPr>
+          <w:p>
+            <w:r>
+              <w:rPr>
+                <w:b/>
+              </w:rPr>
+              <w:t>mAP@0.5 (%)</w:t>
+            </w:r>
+          </w:p>
+        </w:tc>
+        <w:tc>
+          <w:tcPr>
+            <w:tcW w:type="dxa" w:w="1380"/>
+            <w:tcMar>
+              <w:top w:w="70" w:type="dxa"/>
+              <w:bottom w:w="70" w:type="dxa"/>
+              <w:left w:w="80" w:type="dxa"/>
+              <w:right w:w="80" w:type="dxa"/>
+            </w:tcMar>
+            <w:shd w:val="clear" w:color="auto" w:fill="E8EEF5"/>
+          </w:tcPr>
+          <w:p>
+            <w:r>
+              <w:rPr>
+                <w:b/>
+              </w:rPr>
+              <w:t>F1-Score (%)</w:t>
             </w:r>
           </w:p>
         </w:tc>
@@ -380,33 +981,97 @@
       <w:tr>
         <w:tc>
           <w:tcPr>
-            <w:tcW w:type="dxa" w:w="4140"/>
+            <w:tcW w:type="dxa" w:w="1380"/>
             <w:tcMar>
-              <w:top w:w="80" w:type="dxa"/>
-              <w:bottom w:w="80" w:type="dxa"/>
-              <w:left w:w="120" w:type="dxa"/>
-              <w:right w:w="120" w:type="dxa"/>
+              <w:top w:w="70" w:type="dxa"/>
+              <w:bottom w:w="70" w:type="dxa"/>
+              <w:left w:w="80" w:type="dxa"/>
+              <w:right w:w="80" w:type="dxa"/>
             </w:tcMar>
           </w:tcPr>
           <w:p>
             <w:r>
-              <w:t>Nama File Sumber</w:t>
+              <w:t>EXP-01</w:t>
             </w:r>
           </w:p>
         </w:tc>
         <w:tc>
           <w:tcPr>
-            <w:tcW w:type="dxa" w:w="4140"/>
+            <w:tcW w:type="dxa" w:w="1380"/>
             <w:tcMar>
-              <w:top w:w="80" w:type="dxa"/>
-              <w:bottom w:w="80" w:type="dxa"/>
-              <w:left w:w="120" w:type="dxa"/>
-              <w:right w:w="120" w:type="dxa"/>
+              <w:top w:w="70" w:type="dxa"/>
+              <w:bottom w:w="70" w:type="dxa"/>
+              <w:left w:w="80" w:type="dxa"/>
+              <w:right w:w="80" w:type="dxa"/>
             </w:tcMar>
           </w:tcPr>
           <w:p>
             <w:r>
-              <w:t>1138.mp4</w:t>
+              <w:t>Baseline (YOLOv8n RGB Tunggal)</w:t>
+            </w:r>
+          </w:p>
+        </w:tc>
+        <w:tc>
+          <w:tcPr>
+            <w:tcW w:type="dxa" w:w="1380"/>
+            <w:tcMar>
+              <w:top w:w="70" w:type="dxa"/>
+              <w:bottom w:w="70" w:type="dxa"/>
+              <w:left w:w="80" w:type="dxa"/>
+              <w:right w:w="80" w:type="dxa"/>
+            </w:tcMar>
+          </w:tcPr>
+          <w:p>
+            <w:r>
+              <w:t>83.25</w:t>
+            </w:r>
+          </w:p>
+        </w:tc>
+        <w:tc>
+          <w:tcPr>
+            <w:tcW w:type="dxa" w:w="1380"/>
+            <w:tcMar>
+              <w:top w:w="70" w:type="dxa"/>
+              <w:bottom w:w="70" w:type="dxa"/>
+              <w:left w:w="80" w:type="dxa"/>
+              <w:right w:w="80" w:type="dxa"/>
+            </w:tcMar>
+          </w:tcPr>
+          <w:p>
+            <w:r>
+              <w:t>76.66</w:t>
+            </w:r>
+          </w:p>
+        </w:tc>
+        <w:tc>
+          <w:tcPr>
+            <w:tcW w:type="dxa" w:w="1380"/>
+            <w:tcMar>
+              <w:top w:w="70" w:type="dxa"/>
+              <w:bottom w:w="70" w:type="dxa"/>
+              <w:left w:w="80" w:type="dxa"/>
+              <w:right w:w="80" w:type="dxa"/>
+            </w:tcMar>
+          </w:tcPr>
+          <w:p>
+            <w:r>
+              <w:t>87.37</w:t>
+            </w:r>
+          </w:p>
+        </w:tc>
+        <w:tc>
+          <w:tcPr>
+            <w:tcW w:type="dxa" w:w="1380"/>
+            <w:tcMar>
+              <w:top w:w="70" w:type="dxa"/>
+              <w:bottom w:w="70" w:type="dxa"/>
+              <w:left w:w="80" w:type="dxa"/>
+              <w:right w:w="80" w:type="dxa"/>
+            </w:tcMar>
+          </w:tcPr>
+          <w:p>
+            <w:r>
+              <w:t>79.82</w:t>
             </w:r>
           </w:p>
         </w:tc>
@@ -414,33 +1079,97 @@
       <w:tr>
         <w:tc>
           <w:tcPr>
-            <w:tcW w:type="dxa" w:w="4140"/>
+            <w:tcW w:type="dxa" w:w="1380"/>
             <w:tcMar>
-              <w:top w:w="80" w:type="dxa"/>
-              <w:bottom w:w="80" w:type="dxa"/>
-              <w:left w:w="120" w:type="dxa"/>
-              <w:right w:w="120" w:type="dxa"/>
+              <w:top w:w="70" w:type="dxa"/>
+              <w:bottom w:w="70" w:type="dxa"/>
+              <w:left w:w="80" w:type="dxa"/>
+              <w:right w:w="80" w:type="dxa"/>
             </w:tcMar>
           </w:tcPr>
           <w:p>
             <w:r>
-              <w:t>Durasi Video Nyata</w:t>
+              <w:t>EXP-02</w:t>
             </w:r>
           </w:p>
         </w:tc>
         <w:tc>
           <w:tcPr>
-            <w:tcW w:type="dxa" w:w="4140"/>
+            <w:tcW w:type="dxa" w:w="1380"/>
             <w:tcMar>
-              <w:top w:w="80" w:type="dxa"/>
-              <w:bottom w:w="80" w:type="dxa"/>
-              <w:left w:w="120" w:type="dxa"/>
-              <w:right w:w="120" w:type="dxa"/>
+              <w:top w:w="70" w:type="dxa"/>
+              <w:bottom w:w="70" w:type="dxa"/>
+              <w:left w:w="80" w:type="dxa"/>
+              <w:right w:w="80" w:type="dxa"/>
             </w:tcMar>
           </w:tcPr>
           <w:p>
             <w:r>
-              <w:t>300.62 detik (5 Menit 0 Detik)</w:t>
+              <w:t>DEYOLOn-Default (DEPA 3x7, r=16, Sobel)</w:t>
+            </w:r>
+          </w:p>
+        </w:tc>
+        <w:tc>
+          <w:tcPr>
+            <w:tcW w:type="dxa" w:w="1380"/>
+            <w:tcMar>
+              <w:top w:w="70" w:type="dxa"/>
+              <w:bottom w:w="70" w:type="dxa"/>
+              <w:left w:w="80" w:type="dxa"/>
+              <w:right w:w="80" w:type="dxa"/>
+            </w:tcMar>
+          </w:tcPr>
+          <w:p>
+            <w:r>
+              <w:t>81.10</w:t>
+            </w:r>
+          </w:p>
+        </w:tc>
+        <w:tc>
+          <w:tcPr>
+            <w:tcW w:type="dxa" w:w="1380"/>
+            <w:tcMar>
+              <w:top w:w="70" w:type="dxa"/>
+              <w:bottom w:w="70" w:type="dxa"/>
+              <w:left w:w="80" w:type="dxa"/>
+              <w:right w:w="80" w:type="dxa"/>
+            </w:tcMar>
+          </w:tcPr>
+          <w:p>
+            <w:r>
+              <w:t>76.80</w:t>
+            </w:r>
+          </w:p>
+        </w:tc>
+        <w:tc>
+          <w:tcPr>
+            <w:tcW w:type="dxa" w:w="1380"/>
+            <w:tcMar>
+              <w:top w:w="70" w:type="dxa"/>
+              <w:bottom w:w="70" w:type="dxa"/>
+              <w:left w:w="80" w:type="dxa"/>
+              <w:right w:w="80" w:type="dxa"/>
+            </w:tcMar>
+          </w:tcPr>
+          <w:p>
+            <w:r>
+              <w:t>85.40</w:t>
+            </w:r>
+          </w:p>
+        </w:tc>
+        <w:tc>
+          <w:tcPr>
+            <w:tcW w:type="dxa" w:w="1380"/>
+            <w:tcMar>
+              <w:top w:w="70" w:type="dxa"/>
+              <w:bottom w:w="70" w:type="dxa"/>
+              <w:left w:w="80" w:type="dxa"/>
+              <w:right w:w="80" w:type="dxa"/>
+            </w:tcMar>
+          </w:tcPr>
+          <w:p>
+            <w:r>
+              <w:t>78.89</w:t>
             </w:r>
           </w:p>
         </w:tc>
@@ -448,33 +1177,97 @@
       <w:tr>
         <w:tc>
           <w:tcPr>
-            <w:tcW w:type="dxa" w:w="4140"/>
+            <w:tcW w:type="dxa" w:w="1380"/>
             <w:tcMar>
-              <w:top w:w="80" w:type="dxa"/>
-              <w:bottom w:w="80" w:type="dxa"/>
-              <w:left w:w="120" w:type="dxa"/>
-              <w:right w:w="120" w:type="dxa"/>
+              <w:top w:w="70" w:type="dxa"/>
+              <w:bottom w:w="70" w:type="dxa"/>
+              <w:left w:w="80" w:type="dxa"/>
+              <w:right w:w="80" w:type="dxa"/>
             </w:tcMar>
           </w:tcPr>
           <w:p>
             <w:r>
-              <w:t>Kecepatan Bingkai (Frame Rate) Asli</w:t>
+              <w:t>EXP-03</w:t>
             </w:r>
           </w:p>
         </w:tc>
         <w:tc>
           <w:tcPr>
-            <w:tcW w:type="dxa" w:w="4140"/>
+            <w:tcW w:type="dxa" w:w="1380"/>
             <w:tcMar>
-              <w:top w:w="80" w:type="dxa"/>
-              <w:bottom w:w="80" w:type="dxa"/>
-              <w:left w:w="120" w:type="dxa"/>
-              <w:right w:w="120" w:type="dxa"/>
+              <w:top w:w="70" w:type="dxa"/>
+              <w:bottom w:w="70" w:type="dxa"/>
+              <w:left w:w="80" w:type="dxa"/>
+              <w:right w:w="80" w:type="dxa"/>
             </w:tcMar>
           </w:tcPr>
           <w:p>
             <w:r>
-              <w:t>4.833 FPS (29/6 frame/detik)</w:t>
+              <w:t>DEYOLOn (DEPA 3x7, r=8, Sobel)</w:t>
+            </w:r>
+          </w:p>
+        </w:tc>
+        <w:tc>
+          <w:tcPr>
+            <w:tcW w:type="dxa" w:w="1380"/>
+            <w:tcMar>
+              <w:top w:w="70" w:type="dxa"/>
+              <w:bottom w:w="70" w:type="dxa"/>
+              <w:left w:w="80" w:type="dxa"/>
+              <w:right w:w="80" w:type="dxa"/>
+            </w:tcMar>
+          </w:tcPr>
+          <w:p>
+            <w:r>
+              <w:t>75.38</w:t>
+            </w:r>
+          </w:p>
+        </w:tc>
+        <w:tc>
+          <w:tcPr>
+            <w:tcW w:type="dxa" w:w="1380"/>
+            <w:tcMar>
+              <w:top w:w="70" w:type="dxa"/>
+              <w:bottom w:w="70" w:type="dxa"/>
+              <w:left w:w="80" w:type="dxa"/>
+              <w:right w:w="80" w:type="dxa"/>
+            </w:tcMar>
+          </w:tcPr>
+          <w:p>
+            <w:r>
+              <w:t>75.84</w:t>
+            </w:r>
+          </w:p>
+        </w:tc>
+        <w:tc>
+          <w:tcPr>
+            <w:tcW w:type="dxa" w:w="1380"/>
+            <w:tcMar>
+              <w:top w:w="70" w:type="dxa"/>
+              <w:bottom w:w="70" w:type="dxa"/>
+              <w:left w:w="80" w:type="dxa"/>
+              <w:right w:w="80" w:type="dxa"/>
+            </w:tcMar>
+          </w:tcPr>
+          <w:p>
+            <w:r>
+              <w:t>82.28</w:t>
+            </w:r>
+          </w:p>
+        </w:tc>
+        <w:tc>
+          <w:tcPr>
+            <w:tcW w:type="dxa" w:w="1380"/>
+            <w:tcMar>
+              <w:top w:w="70" w:type="dxa"/>
+              <w:bottom w:w="70" w:type="dxa"/>
+              <w:left w:w="80" w:type="dxa"/>
+              <w:right w:w="80" w:type="dxa"/>
+            </w:tcMar>
+          </w:tcPr>
+          <w:p>
+            <w:r>
+              <w:t>75.61</w:t>
             </w:r>
           </w:p>
         </w:tc>
@@ -482,33 +1275,97 @@
       <w:tr>
         <w:tc>
           <w:tcPr>
-            <w:tcW w:type="dxa" w:w="4140"/>
+            <w:tcW w:type="dxa" w:w="1380"/>
             <w:tcMar>
-              <w:top w:w="80" w:type="dxa"/>
-              <w:bottom w:w="80" w:type="dxa"/>
-              <w:left w:w="120" w:type="dxa"/>
-              <w:right w:w="120" w:type="dxa"/>
+              <w:top w:w="70" w:type="dxa"/>
+              <w:bottom w:w="70" w:type="dxa"/>
+              <w:left w:w="80" w:type="dxa"/>
+              <w:right w:w="80" w:type="dxa"/>
             </w:tcMar>
           </w:tcPr>
           <w:p>
             <w:r>
-              <w:t>Total Frame Diproses</w:t>
+              <w:t>EXP-04</w:t>
             </w:r>
           </w:p>
         </w:tc>
         <w:tc>
           <w:tcPr>
-            <w:tcW w:type="dxa" w:w="4140"/>
+            <w:tcW w:type="dxa" w:w="1380"/>
             <w:tcMar>
-              <w:top w:w="80" w:type="dxa"/>
-              <w:bottom w:w="80" w:type="dxa"/>
-              <w:left w:w="120" w:type="dxa"/>
-              <w:right w:w="120" w:type="dxa"/>
+              <w:top w:w="70" w:type="dxa"/>
+              <w:bottom w:w="70" w:type="dxa"/>
+              <w:left w:w="80" w:type="dxa"/>
+              <w:right w:w="80" w:type="dxa"/>
             </w:tcMar>
           </w:tcPr>
           <w:p>
             <w:r>
-              <w:t>1.453 frame (100% Full Frame)</w:t>
+              <w:t>DEYOLOn (DEPA 3x3, r=16, Sobel)</w:t>
+            </w:r>
+          </w:p>
+        </w:tc>
+        <w:tc>
+          <w:tcPr>
+            <w:tcW w:type="dxa" w:w="1380"/>
+            <w:tcMar>
+              <w:top w:w="70" w:type="dxa"/>
+              <w:bottom w:w="70" w:type="dxa"/>
+              <w:left w:w="80" w:type="dxa"/>
+              <w:right w:w="80" w:type="dxa"/>
+            </w:tcMar>
+          </w:tcPr>
+          <w:p>
+            <w:r>
+              <w:t>83.36</w:t>
+            </w:r>
+          </w:p>
+        </w:tc>
+        <w:tc>
+          <w:tcPr>
+            <w:tcW w:type="dxa" w:w="1380"/>
+            <w:tcMar>
+              <w:top w:w="70" w:type="dxa"/>
+              <w:bottom w:w="70" w:type="dxa"/>
+              <w:left w:w="80" w:type="dxa"/>
+              <w:right w:w="80" w:type="dxa"/>
+            </w:tcMar>
+          </w:tcPr>
+          <w:p>
+            <w:r>
+              <w:t>78.44</w:t>
+            </w:r>
+          </w:p>
+        </w:tc>
+        <w:tc>
+          <w:tcPr>
+            <w:tcW w:type="dxa" w:w="1380"/>
+            <w:tcMar>
+              <w:top w:w="70" w:type="dxa"/>
+              <w:bottom w:w="70" w:type="dxa"/>
+              <w:left w:w="80" w:type="dxa"/>
+              <w:right w:w="80" w:type="dxa"/>
+            </w:tcMar>
+          </w:tcPr>
+          <w:p>
+            <w:r>
+              <w:t>86.69</w:t>
+            </w:r>
+          </w:p>
+        </w:tc>
+        <w:tc>
+          <w:tcPr>
+            <w:tcW w:type="dxa" w:w="1380"/>
+            <w:tcMar>
+              <w:top w:w="70" w:type="dxa"/>
+              <w:bottom w:w="70" w:type="dxa"/>
+              <w:left w:w="80" w:type="dxa"/>
+              <w:right w:w="80" w:type="dxa"/>
+            </w:tcMar>
+          </w:tcPr>
+          <w:p>
+            <w:r>
+              <w:t>80.84</w:t>
             </w:r>
           </w:p>
         </w:tc>
@@ -516,33 +1373,121 @@
       <w:tr>
         <w:tc>
           <w:tcPr>
-            <w:tcW w:type="dxa" w:w="4140"/>
+            <w:tcW w:type="dxa" w:w="1380"/>
             <w:tcMar>
-              <w:top w:w="80" w:type="dxa"/>
-              <w:bottom w:w="80" w:type="dxa"/>
-              <w:left w:w="120" w:type="dxa"/>
-              <w:right w:w="120" w:type="dxa"/>
+              <w:top w:w="70" w:type="dxa"/>
+              <w:bottom w:w="70" w:type="dxa"/>
+              <w:left w:w="80" w:type="dxa"/>
+              <w:right w:w="80" w:type="dxa"/>
             </w:tcMar>
+            <w:shd w:val="clear" w:color="auto" w:fill="EAF7EA"/>
           </w:tcPr>
           <w:p>
             <w:r>
-              <w:t>Resolusi Spasial Citra</w:t>
+              <w:rPr>
+                <w:b/>
+              </w:rPr>
+              <w:t>EXP-05</w:t>
             </w:r>
           </w:p>
         </w:tc>
         <w:tc>
           <w:tcPr>
-            <w:tcW w:type="dxa" w:w="4140"/>
+            <w:tcW w:type="dxa" w:w="1380"/>
             <w:tcMar>
-              <w:top w:w="80" w:type="dxa"/>
-              <w:bottom w:w="80" w:type="dxa"/>
-              <w:left w:w="120" w:type="dxa"/>
-              <w:right w:w="120" w:type="dxa"/>
+              <w:top w:w="70" w:type="dxa"/>
+              <w:bottom w:w="70" w:type="dxa"/>
+              <w:left w:w="80" w:type="dxa"/>
+              <w:right w:w="80" w:type="dxa"/>
             </w:tcMar>
+            <w:shd w:val="clear" w:color="auto" w:fill="EAF7EA"/>
           </w:tcPr>
           <w:p>
             <w:r>
-              <w:t>1280 x 720 piksel (HD 720p)</w:t>
+              <w:rPr>
+                <w:b/>
+              </w:rPr>
+              <w:t>DEYOLOn (DEPA 3x3, r=8, Sobel) [⭐ Best F1/Recall]</w:t>
+            </w:r>
+          </w:p>
+        </w:tc>
+        <w:tc>
+          <w:tcPr>
+            <w:tcW w:type="dxa" w:w="1380"/>
+            <w:tcMar>
+              <w:top w:w="70" w:type="dxa"/>
+              <w:bottom w:w="70" w:type="dxa"/>
+              <w:left w:w="80" w:type="dxa"/>
+              <w:right w:w="80" w:type="dxa"/>
+            </w:tcMar>
+            <w:shd w:val="clear" w:color="auto" w:fill="EAF7EA"/>
+          </w:tcPr>
+          <w:p>
+            <w:r>
+              <w:rPr>
+                <w:b/>
+              </w:rPr>
+              <w:t>83.86</w:t>
+            </w:r>
+          </w:p>
+        </w:tc>
+        <w:tc>
+          <w:tcPr>
+            <w:tcW w:type="dxa" w:w="1380"/>
+            <w:tcMar>
+              <w:top w:w="70" w:type="dxa"/>
+              <w:bottom w:w="70" w:type="dxa"/>
+              <w:left w:w="80" w:type="dxa"/>
+              <w:right w:w="80" w:type="dxa"/>
+            </w:tcMar>
+            <w:shd w:val="clear" w:color="auto" w:fill="EAF7EA"/>
+          </w:tcPr>
+          <w:p>
+            <w:r>
+              <w:rPr>
+                <w:b/>
+              </w:rPr>
+              <w:t>78.97</w:t>
+            </w:r>
+          </w:p>
+        </w:tc>
+        <w:tc>
+          <w:tcPr>
+            <w:tcW w:type="dxa" w:w="1380"/>
+            <w:tcMar>
+              <w:top w:w="70" w:type="dxa"/>
+              <w:bottom w:w="70" w:type="dxa"/>
+              <w:left w:w="80" w:type="dxa"/>
+              <w:right w:w="80" w:type="dxa"/>
+            </w:tcMar>
+            <w:shd w:val="clear" w:color="auto" w:fill="EAF7EA"/>
+          </w:tcPr>
+          <w:p>
+            <w:r>
+              <w:rPr>
+                <w:b/>
+              </w:rPr>
+              <w:t>87.14</w:t>
+            </w:r>
+          </w:p>
+        </w:tc>
+        <w:tc>
+          <w:tcPr>
+            <w:tcW w:type="dxa" w:w="1380"/>
+            <w:tcMar>
+              <w:top w:w="70" w:type="dxa"/>
+              <w:bottom w:w="70" w:type="dxa"/>
+              <w:left w:w="80" w:type="dxa"/>
+              <w:right w:w="80" w:type="dxa"/>
+            </w:tcMar>
+            <w:shd w:val="clear" w:color="auto" w:fill="EAF7EA"/>
+          </w:tcPr>
+          <w:p>
+            <w:r>
+              <w:rPr>
+                <w:b/>
+              </w:rPr>
+              <w:t>81.34</w:t>
             </w:r>
           </w:p>
         </w:tc>
@@ -550,33 +1495,97 @@
       <w:tr>
         <w:tc>
           <w:tcPr>
-            <w:tcW w:type="dxa" w:w="4140"/>
+            <w:tcW w:type="dxa" w:w="1380"/>
             <w:tcMar>
-              <w:top w:w="80" w:type="dxa"/>
-              <w:bottom w:w="80" w:type="dxa"/>
-              <w:left w:w="120" w:type="dxa"/>
-              <w:right w:w="120" w:type="dxa"/>
+              <w:top w:w="70" w:type="dxa"/>
+              <w:bottom w:w="70" w:type="dxa"/>
+              <w:left w:w="80" w:type="dxa"/>
+              <w:right w:w="80" w:type="dxa"/>
             </w:tcMar>
           </w:tcPr>
           <w:p>
             <w:r>
-              <w:t>Model Deteksi &amp; Bobot</w:t>
+              <w:t>EXP-06</w:t>
             </w:r>
           </w:p>
         </w:tc>
         <w:tc>
           <w:tcPr>
-            <w:tcW w:type="dxa" w:w="4140"/>
+            <w:tcW w:type="dxa" w:w="1380"/>
             <w:tcMar>
-              <w:top w:w="80" w:type="dxa"/>
-              <w:bottom w:w="80" w:type="dxa"/>
-              <w:left w:w="120" w:type="dxa"/>
-              <w:right w:w="120" w:type="dxa"/>
+              <w:top w:w="70" w:type="dxa"/>
+              <w:bottom w:w="70" w:type="dxa"/>
+              <w:left w:w="80" w:type="dxa"/>
+              <w:right w:w="80" w:type="dxa"/>
             </w:tcMar>
           </w:tcPr>
           <w:p>
             <w:r>
-              <w:t>DEYOLO Dual-Input (Sobel Pseudo-IR, exp05_best.pt)</w:t>
+              <w:t>DEYOLOn (DEPA 3x3, r=4, Sobel)</w:t>
+            </w:r>
+          </w:p>
+        </w:tc>
+        <w:tc>
+          <w:tcPr>
+            <w:tcW w:type="dxa" w:w="1380"/>
+            <w:tcMar>
+              <w:top w:w="70" w:type="dxa"/>
+              <w:bottom w:w="70" w:type="dxa"/>
+              <w:left w:w="80" w:type="dxa"/>
+              <w:right w:w="80" w:type="dxa"/>
+            </w:tcMar>
+          </w:tcPr>
+          <w:p>
+            <w:r>
+              <w:t>81.57</w:t>
+            </w:r>
+          </w:p>
+        </w:tc>
+        <w:tc>
+          <w:tcPr>
+            <w:tcW w:type="dxa" w:w="1380"/>
+            <w:tcMar>
+              <w:top w:w="70" w:type="dxa"/>
+              <w:bottom w:w="70" w:type="dxa"/>
+              <w:left w:w="80" w:type="dxa"/>
+              <w:right w:w="80" w:type="dxa"/>
+            </w:tcMar>
+          </w:tcPr>
+          <w:p>
+            <w:r>
+              <w:t>78.73</w:t>
+            </w:r>
+          </w:p>
+        </w:tc>
+        <w:tc>
+          <w:tcPr>
+            <w:tcW w:type="dxa" w:w="1380"/>
+            <w:tcMar>
+              <w:top w:w="70" w:type="dxa"/>
+              <w:bottom w:w="70" w:type="dxa"/>
+              <w:left w:w="80" w:type="dxa"/>
+              <w:right w:w="80" w:type="dxa"/>
+            </w:tcMar>
+          </w:tcPr>
+          <w:p>
+            <w:r>
+              <w:t>84.92</w:t>
+            </w:r>
+          </w:p>
+        </w:tc>
+        <w:tc>
+          <w:tcPr>
+            <w:tcW w:type="dxa" w:w="1380"/>
+            <w:tcMar>
+              <w:top w:w="70" w:type="dxa"/>
+              <w:bottom w:w="70" w:type="dxa"/>
+              <w:left w:w="80" w:type="dxa"/>
+              <w:right w:w="80" w:type="dxa"/>
+            </w:tcMar>
+          </w:tcPr>
+          <w:p>
+            <w:r>
+              <w:t>80.12</w:t>
             </w:r>
           </w:p>
         </w:tc>
@@ -584,38 +1593,139 @@
       <w:tr>
         <w:tc>
           <w:tcPr>
-            <w:tcW w:type="dxa" w:w="4140"/>
+            <w:tcW w:type="dxa" w:w="1380"/>
             <w:tcMar>
-              <w:top w:w="80" w:type="dxa"/>
-              <w:bottom w:w="80" w:type="dxa"/>
-              <w:left w:w="120" w:type="dxa"/>
-              <w:right w:w="120" w:type="dxa"/>
+              <w:top w:w="70" w:type="dxa"/>
+              <w:bottom w:w="70" w:type="dxa"/>
+              <w:left w:w="80" w:type="dxa"/>
+              <w:right w:w="80" w:type="dxa"/>
             </w:tcMar>
+            <w:shd w:val="clear" w:color="auto" w:fill="FDF6E2"/>
           </w:tcPr>
           <w:p>
             <w:r>
-              <w:t>Algoritma Pelacak &amp; Parameter</w:t>
+              <w:rPr>
+                <w:b/>
+              </w:rPr>
+              <w:t>EXP-07</w:t>
             </w:r>
           </w:p>
         </w:tc>
         <w:tc>
           <w:tcPr>
-            <w:tcW w:type="dxa" w:w="4140"/>
+            <w:tcW w:type="dxa" w:w="1380"/>
             <w:tcMar>
-              <w:top w:w="80" w:type="dxa"/>
-              <w:bottom w:w="80" w:type="dxa"/>
-              <w:left w:w="120" w:type="dxa"/>
-              <w:right w:w="120" w:type="dxa"/>
+              <w:top w:w="70" w:type="dxa"/>
+              <w:bottom w:w="70" w:type="dxa"/>
+              <w:left w:w="80" w:type="dxa"/>
+              <w:right w:w="80" w:type="dxa"/>
             </w:tcMar>
+            <w:shd w:val="clear" w:color="auto" w:fill="FDF6E2"/>
           </w:tcPr>
           <w:p>
             <w:r>
-              <w:t>ByteTrack (Track Thresh: 0.40, Match Thresh: 0.80, Buffer: 45)</w:t>
+              <w:rPr>
+                <w:b/>
+              </w:rPr>
+              <w:t>DEYOLOn (DEPA 3x3, r=8, CLAHE+Sobel) [🎯 Best Precision]</w:t>
+            </w:r>
+          </w:p>
+        </w:tc>
+        <w:tc>
+          <w:tcPr>
+            <w:tcW w:type="dxa" w:w="1380"/>
+            <w:tcMar>
+              <w:top w:w="70" w:type="dxa"/>
+              <w:bottom w:w="70" w:type="dxa"/>
+              <w:left w:w="80" w:type="dxa"/>
+              <w:right w:w="80" w:type="dxa"/>
+            </w:tcMar>
+            <w:shd w:val="clear" w:color="auto" w:fill="FDF6E2"/>
+          </w:tcPr>
+          <w:p>
+            <w:r>
+              <w:rPr>
+                <w:b/>
+              </w:rPr>
+              <w:t>85.81</w:t>
+            </w:r>
+          </w:p>
+        </w:tc>
+        <w:tc>
+          <w:tcPr>
+            <w:tcW w:type="dxa" w:w="1380"/>
+            <w:tcMar>
+              <w:top w:w="70" w:type="dxa"/>
+              <w:bottom w:w="70" w:type="dxa"/>
+              <w:left w:w="80" w:type="dxa"/>
+              <w:right w:w="80" w:type="dxa"/>
+            </w:tcMar>
+            <w:shd w:val="clear" w:color="auto" w:fill="FDF6E2"/>
+          </w:tcPr>
+          <w:p>
+            <w:r>
+              <w:rPr>
+                <w:b/>
+              </w:rPr>
+              <w:t>74.92</w:t>
+            </w:r>
+          </w:p>
+        </w:tc>
+        <w:tc>
+          <w:tcPr>
+            <w:tcW w:type="dxa" w:w="1380"/>
+            <w:tcMar>
+              <w:top w:w="70" w:type="dxa"/>
+              <w:bottom w:w="70" w:type="dxa"/>
+              <w:left w:w="80" w:type="dxa"/>
+              <w:right w:w="80" w:type="dxa"/>
+            </w:tcMar>
+            <w:shd w:val="clear" w:color="auto" w:fill="FDF6E2"/>
+          </w:tcPr>
+          <w:p>
+            <w:r>
+              <w:rPr>
+                <w:b/>
+              </w:rPr>
+              <w:t>87.28</w:t>
+            </w:r>
+          </w:p>
+        </w:tc>
+        <w:tc>
+          <w:tcPr>
+            <w:tcW w:type="dxa" w:w="1380"/>
+            <w:tcMar>
+              <w:top w:w="70" w:type="dxa"/>
+              <w:bottom w:w="70" w:type="dxa"/>
+              <w:left w:w="80" w:type="dxa"/>
+              <w:right w:w="80" w:type="dxa"/>
+            </w:tcMar>
+            <w:shd w:val="clear" w:color="auto" w:fill="FDF6E2"/>
+          </w:tcPr>
+          <w:p>
+            <w:r>
+              <w:rPr>
+                <w:b/>
+              </w:rPr>
+              <w:t>79.99</w:t>
             </w:r>
           </w:p>
         </w:tc>
       </w:tr>
     </w:tbl>
+    <w:p>
+      <w:pPr>
+        <w:ind w:firstLine="576"/>
+        <w:jc w:val="both"/>
+      </w:pPr>
+      <w:r>
+        <w:t>Analisis Kritis Hasil Deteksi:</w:t>
+        <w:br/>
+        <w:t>1. Konfigurasi EXP-05 (DEPA 3x3, r=8, Sobel) berhasil meraih Recall tertinggi (78.97%) dan F1-Score tertinggi (81.34%), dengan peningkatan Recall sebesar +2.31% dan F1-Score sebesar +1.52% dibandingkan Baseline YOLOv8n. Karena aplikasi penghitungan lalu lintas (traffic counting) sangat sensitif terhadap kendaraan yang terlewat (false negatives), maka EXP-05 dipilih sebagai model utama inferensi tracking.</w:t>
+        <w:br/>
+        <w:t>2. Konfigurasi EXP-07 (CLAHE + Sobel) meraih Precision tertinggi (85.81%, +2.56% di atas baseline) yang sangat efektif menekan false positive akibat pantulan aspal basah.</w:t>
+      </w:r>
+    </w:p>
     <w:p>
       <w:pPr>
         <w:spacing w:after="120"/>
@@ -624,7 +1734,7 @@
         <w:rPr>
           <w:b/>
         </w:rPr>
-        <w:t>4.2 Hasil Penghitungan Volume Lalu Lintas (Traffic Volume Analysis)</w:t>
+        <w:t>4.2 Hasil Pengujian Tracking dan Penghitungan Volume Kendaraan (Video 5 Menit)</w:t>
       </w:r>
     </w:p>
     <w:p>
@@ -633,7 +1743,7 @@
         <w:jc w:val="both"/>
       </w:pPr>
       <w:r>
-        <w:t>Berdasarkan pemrosesan 1.453 frame secara penuh pada video berdurasi 5 menit, sistem berhasil mendeteksi dan menghitung seluruh kendaraan yang melintasi garis hitung virtual tanpa ada duplikasi hitungan. Rekapitulasi hasil penghitungan disajikan pada Tabel 4.2.</w:t>
+        <w:t>Pengujian end-to-end tracking dan counting dilakukan pada rekaman video CCTV jalan tol (1138.mp4) berdurasi 5 menit (300.62 detik, 1.453 frame pada 4.833 FPS) menggunakan kombinasi model optimal DEYOLO EXP-05 dan ByteTrack. Rekapitulasi volume kendaraan terhitung disajikan pada Tabel 4.2.</w:t>
       </w:r>
     </w:p>
     <w:p>
@@ -665,10 +1775,10 @@
           <w:tcPr>
             <w:tcW w:type="dxa" w:w="1656"/>
             <w:tcMar>
-              <w:top w:w="80" w:type="dxa"/>
-              <w:bottom w:w="80" w:type="dxa"/>
-              <w:left w:w="100" w:type="dxa"/>
-              <w:right w:w="100" w:type="dxa"/>
+              <w:top w:w="70" w:type="dxa"/>
+              <w:bottom w:w="70" w:type="dxa"/>
+              <w:left w:w="90" w:type="dxa"/>
+              <w:right w:w="90" w:type="dxa"/>
             </w:tcMar>
             <w:shd w:val="clear" w:color="auto" w:fill="E8EEF5"/>
           </w:tcPr>
@@ -685,10 +1795,10 @@
           <w:tcPr>
             <w:tcW w:type="dxa" w:w="1656"/>
             <w:tcMar>
-              <w:top w:w="80" w:type="dxa"/>
-              <w:bottom w:w="80" w:type="dxa"/>
-              <w:left w:w="100" w:type="dxa"/>
-              <w:right w:w="100" w:type="dxa"/>
+              <w:top w:w="70" w:type="dxa"/>
+              <w:bottom w:w="70" w:type="dxa"/>
+              <w:left w:w="90" w:type="dxa"/>
+              <w:right w:w="90" w:type="dxa"/>
             </w:tcMar>
             <w:shd w:val="clear" w:color="auto" w:fill="E8EEF5"/>
           </w:tcPr>
@@ -705,10 +1815,10 @@
           <w:tcPr>
             <w:tcW w:type="dxa" w:w="1656"/>
             <w:tcMar>
-              <w:top w:w="80" w:type="dxa"/>
-              <w:bottom w:w="80" w:type="dxa"/>
-              <w:left w:w="100" w:type="dxa"/>
-              <w:right w:w="100" w:type="dxa"/>
+              <w:top w:w="70" w:type="dxa"/>
+              <w:bottom w:w="70" w:type="dxa"/>
+              <w:left w:w="90" w:type="dxa"/>
+              <w:right w:w="90" w:type="dxa"/>
             </w:tcMar>
             <w:shd w:val="clear" w:color="auto" w:fill="E8EEF5"/>
           </w:tcPr>
@@ -725,10 +1835,10 @@
           <w:tcPr>
             <w:tcW w:type="dxa" w:w="1656"/>
             <w:tcMar>
-              <w:top w:w="80" w:type="dxa"/>
-              <w:bottom w:w="80" w:type="dxa"/>
-              <w:left w:w="100" w:type="dxa"/>
-              <w:right w:w="100" w:type="dxa"/>
+              <w:top w:w="70" w:type="dxa"/>
+              <w:bottom w:w="70" w:type="dxa"/>
+              <w:left w:w="90" w:type="dxa"/>
+              <w:right w:w="90" w:type="dxa"/>
             </w:tcMar>
             <w:shd w:val="clear" w:color="auto" w:fill="E8EEF5"/>
           </w:tcPr>
@@ -745,10 +1855,10 @@
           <w:tcPr>
             <w:tcW w:type="dxa" w:w="1656"/>
             <w:tcMar>
-              <w:top w:w="80" w:type="dxa"/>
-              <w:bottom w:w="80" w:type="dxa"/>
-              <w:left w:w="100" w:type="dxa"/>
-              <w:right w:w="100" w:type="dxa"/>
+              <w:top w:w="70" w:type="dxa"/>
+              <w:bottom w:w="70" w:type="dxa"/>
+              <w:left w:w="90" w:type="dxa"/>
+              <w:right w:w="90" w:type="dxa"/>
             </w:tcMar>
             <w:shd w:val="clear" w:color="auto" w:fill="E8EEF5"/>
           </w:tcPr>
@@ -767,10 +1877,10 @@
           <w:tcPr>
             <w:tcW w:type="dxa" w:w="1656"/>
             <w:tcMar>
-              <w:top w:w="80" w:type="dxa"/>
-              <w:bottom w:w="80" w:type="dxa"/>
-              <w:left w:w="100" w:type="dxa"/>
-              <w:right w:w="100" w:type="dxa"/>
+              <w:top w:w="70" w:type="dxa"/>
+              <w:bottom w:w="70" w:type="dxa"/>
+              <w:left w:w="90" w:type="dxa"/>
+              <w:right w:w="90" w:type="dxa"/>
             </w:tcMar>
           </w:tcPr>
           <w:p>
@@ -783,10 +1893,10 @@
           <w:tcPr>
             <w:tcW w:type="dxa" w:w="1656"/>
             <w:tcMar>
-              <w:top w:w="80" w:type="dxa"/>
-              <w:bottom w:w="80" w:type="dxa"/>
-              <w:left w:w="100" w:type="dxa"/>
-              <w:right w:w="100" w:type="dxa"/>
+              <w:top w:w="70" w:type="dxa"/>
+              <w:bottom w:w="70" w:type="dxa"/>
+              <w:left w:w="90" w:type="dxa"/>
+              <w:right w:w="90" w:type="dxa"/>
             </w:tcMar>
           </w:tcPr>
           <w:p>
@@ -799,10 +1909,10 @@
           <w:tcPr>
             <w:tcW w:type="dxa" w:w="1656"/>
             <w:tcMar>
-              <w:top w:w="80" w:type="dxa"/>
-              <w:bottom w:w="80" w:type="dxa"/>
-              <w:left w:w="100" w:type="dxa"/>
-              <w:right w:w="100" w:type="dxa"/>
+              <w:top w:w="70" w:type="dxa"/>
+              <w:bottom w:w="70" w:type="dxa"/>
+              <w:left w:w="90" w:type="dxa"/>
+              <w:right w:w="90" w:type="dxa"/>
             </w:tcMar>
           </w:tcPr>
           <w:p>
@@ -815,10 +1925,10 @@
           <w:tcPr>
             <w:tcW w:type="dxa" w:w="1656"/>
             <w:tcMar>
-              <w:top w:w="80" w:type="dxa"/>
-              <w:bottom w:w="80" w:type="dxa"/>
-              <w:left w:w="100" w:type="dxa"/>
-              <w:right w:w="100" w:type="dxa"/>
+              <w:top w:w="70" w:type="dxa"/>
+              <w:bottom w:w="70" w:type="dxa"/>
+              <w:left w:w="90" w:type="dxa"/>
+              <w:right w:w="90" w:type="dxa"/>
             </w:tcMar>
           </w:tcPr>
           <w:p>
@@ -831,10 +1941,10 @@
           <w:tcPr>
             <w:tcW w:type="dxa" w:w="1656"/>
             <w:tcMar>
-              <w:top w:w="80" w:type="dxa"/>
-              <w:bottom w:w="80" w:type="dxa"/>
-              <w:left w:w="100" w:type="dxa"/>
-              <w:right w:w="100" w:type="dxa"/>
+              <w:top w:w="70" w:type="dxa"/>
+              <w:bottom w:w="70" w:type="dxa"/>
+              <w:left w:w="90" w:type="dxa"/>
+              <w:right w:w="90" w:type="dxa"/>
             </w:tcMar>
           </w:tcPr>
           <w:p>
@@ -849,10 +1959,10 @@
           <w:tcPr>
             <w:tcW w:type="dxa" w:w="1656"/>
             <w:tcMar>
-              <w:top w:w="80" w:type="dxa"/>
-              <w:bottom w:w="80" w:type="dxa"/>
-              <w:left w:w="100" w:type="dxa"/>
-              <w:right w:w="100" w:type="dxa"/>
+              <w:top w:w="70" w:type="dxa"/>
+              <w:bottom w:w="70" w:type="dxa"/>
+              <w:left w:w="90" w:type="dxa"/>
+              <w:right w:w="90" w:type="dxa"/>
             </w:tcMar>
           </w:tcPr>
           <w:p>
@@ -865,10 +1975,10 @@
           <w:tcPr>
             <w:tcW w:type="dxa" w:w="1656"/>
             <w:tcMar>
-              <w:top w:w="80" w:type="dxa"/>
-              <w:bottom w:w="80" w:type="dxa"/>
-              <w:left w:w="100" w:type="dxa"/>
-              <w:right w:w="100" w:type="dxa"/>
+              <w:top w:w="70" w:type="dxa"/>
+              <w:bottom w:w="70" w:type="dxa"/>
+              <w:left w:w="90" w:type="dxa"/>
+              <w:right w:w="90" w:type="dxa"/>
             </w:tcMar>
           </w:tcPr>
           <w:p>
@@ -881,10 +1991,10 @@
           <w:tcPr>
             <w:tcW w:type="dxa" w:w="1656"/>
             <w:tcMar>
-              <w:top w:w="80" w:type="dxa"/>
-              <w:bottom w:w="80" w:type="dxa"/>
-              <w:left w:w="100" w:type="dxa"/>
-              <w:right w:w="100" w:type="dxa"/>
+              <w:top w:w="70" w:type="dxa"/>
+              <w:bottom w:w="70" w:type="dxa"/>
+              <w:left w:w="90" w:type="dxa"/>
+              <w:right w:w="90" w:type="dxa"/>
             </w:tcMar>
           </w:tcPr>
           <w:p>
@@ -897,10 +2007,10 @@
           <w:tcPr>
             <w:tcW w:type="dxa" w:w="1656"/>
             <w:tcMar>
-              <w:top w:w="80" w:type="dxa"/>
-              <w:bottom w:w="80" w:type="dxa"/>
-              <w:left w:w="100" w:type="dxa"/>
-              <w:right w:w="100" w:type="dxa"/>
+              <w:top w:w="70" w:type="dxa"/>
+              <w:bottom w:w="70" w:type="dxa"/>
+              <w:left w:w="90" w:type="dxa"/>
+              <w:right w:w="90" w:type="dxa"/>
             </w:tcMar>
           </w:tcPr>
           <w:p>
@@ -913,10 +2023,10 @@
           <w:tcPr>
             <w:tcW w:type="dxa" w:w="1656"/>
             <w:tcMar>
-              <w:top w:w="80" w:type="dxa"/>
-              <w:bottom w:w="80" w:type="dxa"/>
-              <w:left w:w="100" w:type="dxa"/>
-              <w:right w:w="100" w:type="dxa"/>
+              <w:top w:w="70" w:type="dxa"/>
+              <w:bottom w:w="70" w:type="dxa"/>
+              <w:left w:w="90" w:type="dxa"/>
+              <w:right w:w="90" w:type="dxa"/>
             </w:tcMar>
           </w:tcPr>
           <w:p>
@@ -931,10 +2041,10 @@
           <w:tcPr>
             <w:tcW w:type="dxa" w:w="1656"/>
             <w:tcMar>
-              <w:top w:w="80" w:type="dxa"/>
-              <w:bottom w:w="80" w:type="dxa"/>
-              <w:left w:w="100" w:type="dxa"/>
-              <w:right w:w="100" w:type="dxa"/>
+              <w:top w:w="70" w:type="dxa"/>
+              <w:bottom w:w="70" w:type="dxa"/>
+              <w:left w:w="90" w:type="dxa"/>
+              <w:right w:w="90" w:type="dxa"/>
             </w:tcMar>
             <w:shd w:val="clear" w:color="auto" w:fill="F2F4F7"/>
           </w:tcPr>
@@ -951,10 +2061,10 @@
           <w:tcPr>
             <w:tcW w:type="dxa" w:w="1656"/>
             <w:tcMar>
-              <w:top w:w="80" w:type="dxa"/>
-              <w:bottom w:w="80" w:type="dxa"/>
-              <w:left w:w="100" w:type="dxa"/>
-              <w:right w:w="100" w:type="dxa"/>
+              <w:top w:w="70" w:type="dxa"/>
+              <w:bottom w:w="70" w:type="dxa"/>
+              <w:left w:w="90" w:type="dxa"/>
+              <w:right w:w="90" w:type="dxa"/>
             </w:tcMar>
             <w:shd w:val="clear" w:color="auto" w:fill="F2F4F7"/>
           </w:tcPr>
@@ -971,10 +2081,10 @@
           <w:tcPr>
             <w:tcW w:type="dxa" w:w="1656"/>
             <w:tcMar>
-              <w:top w:w="80" w:type="dxa"/>
-              <w:bottom w:w="80" w:type="dxa"/>
-              <w:left w:w="100" w:type="dxa"/>
-              <w:right w:w="100" w:type="dxa"/>
+              <w:top w:w="70" w:type="dxa"/>
+              <w:bottom w:w="70" w:type="dxa"/>
+              <w:left w:w="90" w:type="dxa"/>
+              <w:right w:w="90" w:type="dxa"/>
             </w:tcMar>
             <w:shd w:val="clear" w:color="auto" w:fill="F2F4F7"/>
           </w:tcPr>
@@ -991,10 +2101,10 @@
           <w:tcPr>
             <w:tcW w:type="dxa" w:w="1656"/>
             <w:tcMar>
-              <w:top w:w="80" w:type="dxa"/>
-              <w:bottom w:w="80" w:type="dxa"/>
-              <w:left w:w="100" w:type="dxa"/>
-              <w:right w:w="100" w:type="dxa"/>
+              <w:top w:w="70" w:type="dxa"/>
+              <w:bottom w:w="70" w:type="dxa"/>
+              <w:left w:w="90" w:type="dxa"/>
+              <w:right w:w="90" w:type="dxa"/>
             </w:tcMar>
             <w:shd w:val="clear" w:color="auto" w:fill="F2F4F7"/>
           </w:tcPr>
@@ -1011,10 +2121,10 @@
           <w:tcPr>
             <w:tcW w:type="dxa" w:w="1656"/>
             <w:tcMar>
-              <w:top w:w="80" w:type="dxa"/>
-              <w:bottom w:w="80" w:type="dxa"/>
-              <w:left w:w="100" w:type="dxa"/>
-              <w:right w:w="100" w:type="dxa"/>
+              <w:top w:w="70" w:type="dxa"/>
+              <w:bottom w:w="70" w:type="dxa"/>
+              <w:left w:w="90" w:type="dxa"/>
+              <w:right w:w="90" w:type="dxa"/>
             </w:tcMar>
             <w:shd w:val="clear" w:color="auto" w:fill="F2F4F7"/>
           </w:tcPr>
@@ -1031,16 +2141,13 @@
     </w:tbl>
     <w:p>
       <w:pPr>
-        <w:spacing w:before="160"/>
         <w:ind w:firstLine="576"/>
         <w:jc w:val="both"/>
       </w:pPr>
       <w:r>
-        <w:t>Berdasarkan standar Manual Kapasitas Jalan Indonesia (MKJI), volume kendaraan selama interval pengamatan 5 menit (T = 300.62 detik = 0.0835 jam) dapat diekstrapolasikan ke dalam laju arus lalu lintas per jam (Q_jam):</w:t>
+        <w:t>Berdasarkan standar MKJI, ekstrapolasi laju arus lalu lintas per jam (Q_jam) selama durasi pengamatan 300.62 detik adalah:</w:t>
         <w:br/>
-        <w:t>Q_jam = N_total / T_jam = 312 unit / (300.62 / 3600) jam = 3.736 kendaraan/jam.</w:t>
-        <w:br/>
-        <w:t>Dengan rincian laju arus masuk (IN) sebesar 2.515 kend/jam dan laju arus keluar (OUT) sebesar 1.221 kend/jam.</w:t>
+        <w:t>Q_jam = 312 unit / (300.62 / 3600 jam) = 3.736 kendaraan/jam (Arus Masuk: 2.515 kend/jam, Arus Keluar: 1.221 kend/jam).</w:t>
       </w:r>
     </w:p>
     <w:p>
@@ -1060,7 +2167,7 @@
         <w:jc w:val="both"/>
       </w:pPr>
       <w:r>
-        <w:t>Model DEYOLO secara simultan melakukan klasifikasi jenis kendaraan ke dalam tiga kelas utama: mobil penumpang (car), truk (truck), dan bus (bus). Distribusi kelas kendaraan terhitung disajikan pada Tabel 4.3.</w:t>
+        <w:t>Distribusi multi-kelas dari 312 kendaraan yang berhasil dihitung disajikan pada Tabel 4.3.</w:t>
       </w:r>
     </w:p>
     <w:p>
@@ -1092,10 +2199,10 @@
           <w:tcPr>
             <w:tcW w:type="dxa" w:w="1656"/>
             <w:tcMar>
-              <w:top w:w="80" w:type="dxa"/>
-              <w:bottom w:w="80" w:type="dxa"/>
-              <w:left w:w="100" w:type="dxa"/>
-              <w:right w:w="100" w:type="dxa"/>
+              <w:top w:w="70" w:type="dxa"/>
+              <w:bottom w:w="70" w:type="dxa"/>
+              <w:left w:w="90" w:type="dxa"/>
+              <w:right w:w="90" w:type="dxa"/>
             </w:tcMar>
             <w:shd w:val="clear" w:color="auto" w:fill="E8EEF5"/>
           </w:tcPr>
@@ -1112,10 +2219,10 @@
           <w:tcPr>
             <w:tcW w:type="dxa" w:w="1656"/>
             <w:tcMar>
-              <w:top w:w="80" w:type="dxa"/>
-              <w:bottom w:w="80" w:type="dxa"/>
-              <w:left w:w="100" w:type="dxa"/>
-              <w:right w:w="100" w:type="dxa"/>
+              <w:top w:w="70" w:type="dxa"/>
+              <w:bottom w:w="70" w:type="dxa"/>
+              <w:left w:w="90" w:type="dxa"/>
+              <w:right w:w="90" w:type="dxa"/>
             </w:tcMar>
             <w:shd w:val="clear" w:color="auto" w:fill="E8EEF5"/>
           </w:tcPr>
@@ -1132,10 +2239,10 @@
           <w:tcPr>
             <w:tcW w:type="dxa" w:w="1656"/>
             <w:tcMar>
-              <w:top w:w="80" w:type="dxa"/>
-              <w:bottom w:w="80" w:type="dxa"/>
-              <w:left w:w="100" w:type="dxa"/>
-              <w:right w:w="100" w:type="dxa"/>
+              <w:top w:w="70" w:type="dxa"/>
+              <w:bottom w:w="70" w:type="dxa"/>
+              <w:left w:w="90" w:type="dxa"/>
+              <w:right w:w="90" w:type="dxa"/>
             </w:tcMar>
             <w:shd w:val="clear" w:color="auto" w:fill="E8EEF5"/>
           </w:tcPr>
@@ -1152,10 +2259,10 @@
           <w:tcPr>
             <w:tcW w:type="dxa" w:w="1656"/>
             <w:tcMar>
-              <w:top w:w="80" w:type="dxa"/>
-              <w:bottom w:w="80" w:type="dxa"/>
-              <w:left w:w="100" w:type="dxa"/>
-              <w:right w:w="100" w:type="dxa"/>
+              <w:top w:w="70" w:type="dxa"/>
+              <w:bottom w:w="70" w:type="dxa"/>
+              <w:left w:w="90" w:type="dxa"/>
+              <w:right w:w="90" w:type="dxa"/>
             </w:tcMar>
             <w:shd w:val="clear" w:color="auto" w:fill="E8EEF5"/>
           </w:tcPr>
@@ -1172,10 +2279,10 @@
           <w:tcPr>
             <w:tcW w:type="dxa" w:w="1656"/>
             <w:tcMar>
-              <w:top w:w="80" w:type="dxa"/>
-              <w:bottom w:w="80" w:type="dxa"/>
-              <w:left w:w="100" w:type="dxa"/>
-              <w:right w:w="100" w:type="dxa"/>
+              <w:top w:w="70" w:type="dxa"/>
+              <w:bottom w:w="70" w:type="dxa"/>
+              <w:left w:w="90" w:type="dxa"/>
+              <w:right w:w="90" w:type="dxa"/>
             </w:tcMar>
             <w:shd w:val="clear" w:color="auto" w:fill="E8EEF5"/>
           </w:tcPr>
@@ -1184,7 +2291,7 @@
               <w:rPr>
                 <w:b/>
               </w:rPr>
-              <w:t>Proporsi Relatif (%)</w:t>
+              <w:t>Proporsi (%)</w:t>
             </w:r>
           </w:p>
         </w:tc>
@@ -1194,10 +2301,10 @@
           <w:tcPr>
             <w:tcW w:type="dxa" w:w="1656"/>
             <w:tcMar>
-              <w:top w:w="80" w:type="dxa"/>
-              <w:bottom w:w="80" w:type="dxa"/>
-              <w:left w:w="100" w:type="dxa"/>
-              <w:right w:w="100" w:type="dxa"/>
+              <w:top w:w="70" w:type="dxa"/>
+              <w:bottom w:w="70" w:type="dxa"/>
+              <w:left w:w="90" w:type="dxa"/>
+              <w:right w:w="90" w:type="dxa"/>
             </w:tcMar>
           </w:tcPr>
           <w:p>
@@ -1210,10 +2317,10 @@
           <w:tcPr>
             <w:tcW w:type="dxa" w:w="1656"/>
             <w:tcMar>
-              <w:top w:w="80" w:type="dxa"/>
-              <w:bottom w:w="80" w:type="dxa"/>
-              <w:left w:w="100" w:type="dxa"/>
-              <w:right w:w="100" w:type="dxa"/>
+              <w:top w:w="70" w:type="dxa"/>
+              <w:bottom w:w="70" w:type="dxa"/>
+              <w:left w:w="90" w:type="dxa"/>
+              <w:right w:w="90" w:type="dxa"/>
             </w:tcMar>
           </w:tcPr>
           <w:p>
@@ -1226,10 +2333,10 @@
           <w:tcPr>
             <w:tcW w:type="dxa" w:w="1656"/>
             <w:tcMar>
-              <w:top w:w="80" w:type="dxa"/>
-              <w:bottom w:w="80" w:type="dxa"/>
-              <w:left w:w="100" w:type="dxa"/>
-              <w:right w:w="100" w:type="dxa"/>
+              <w:top w:w="70" w:type="dxa"/>
+              <w:bottom w:w="70" w:type="dxa"/>
+              <w:left w:w="90" w:type="dxa"/>
+              <w:right w:w="90" w:type="dxa"/>
             </w:tcMar>
           </w:tcPr>
           <w:p>
@@ -1242,10 +2349,10 @@
           <w:tcPr>
             <w:tcW w:type="dxa" w:w="1656"/>
             <w:tcMar>
-              <w:top w:w="80" w:type="dxa"/>
-              <w:bottom w:w="80" w:type="dxa"/>
-              <w:left w:w="100" w:type="dxa"/>
-              <w:right w:w="100" w:type="dxa"/>
+              <w:top w:w="70" w:type="dxa"/>
+              <w:bottom w:w="70" w:type="dxa"/>
+              <w:left w:w="90" w:type="dxa"/>
+              <w:right w:w="90" w:type="dxa"/>
             </w:tcMar>
           </w:tcPr>
           <w:p>
@@ -1258,10 +2365,10 @@
           <w:tcPr>
             <w:tcW w:type="dxa" w:w="1656"/>
             <w:tcMar>
-              <w:top w:w="80" w:type="dxa"/>
-              <w:bottom w:w="80" w:type="dxa"/>
-              <w:left w:w="100" w:type="dxa"/>
-              <w:right w:w="100" w:type="dxa"/>
+              <w:top w:w="70" w:type="dxa"/>
+              <w:bottom w:w="70" w:type="dxa"/>
+              <w:left w:w="90" w:type="dxa"/>
+              <w:right w:w="90" w:type="dxa"/>
             </w:tcMar>
           </w:tcPr>
           <w:p>
@@ -1276,10 +2383,10 @@
           <w:tcPr>
             <w:tcW w:type="dxa" w:w="1656"/>
             <w:tcMar>
-              <w:top w:w="80" w:type="dxa"/>
-              <w:bottom w:w="80" w:type="dxa"/>
-              <w:left w:w="100" w:type="dxa"/>
-              <w:right w:w="100" w:type="dxa"/>
+              <w:top w:w="70" w:type="dxa"/>
+              <w:bottom w:w="70" w:type="dxa"/>
+              <w:left w:w="90" w:type="dxa"/>
+              <w:right w:w="90" w:type="dxa"/>
             </w:tcMar>
           </w:tcPr>
           <w:p>
@@ -1292,10 +2399,10 @@
           <w:tcPr>
             <w:tcW w:type="dxa" w:w="1656"/>
             <w:tcMar>
-              <w:top w:w="80" w:type="dxa"/>
-              <w:bottom w:w="80" w:type="dxa"/>
-              <w:left w:w="100" w:type="dxa"/>
-              <w:right w:w="100" w:type="dxa"/>
+              <w:top w:w="70" w:type="dxa"/>
+              <w:bottom w:w="70" w:type="dxa"/>
+              <w:left w:w="90" w:type="dxa"/>
+              <w:right w:w="90" w:type="dxa"/>
             </w:tcMar>
           </w:tcPr>
           <w:p>
@@ -1308,10 +2415,10 @@
           <w:tcPr>
             <w:tcW w:type="dxa" w:w="1656"/>
             <w:tcMar>
-              <w:top w:w="80" w:type="dxa"/>
-              <w:bottom w:w="80" w:type="dxa"/>
-              <w:left w:w="100" w:type="dxa"/>
-              <w:right w:w="100" w:type="dxa"/>
+              <w:top w:w="70" w:type="dxa"/>
+              <w:bottom w:w="70" w:type="dxa"/>
+              <w:left w:w="90" w:type="dxa"/>
+              <w:right w:w="90" w:type="dxa"/>
             </w:tcMar>
           </w:tcPr>
           <w:p>
@@ -1324,10 +2431,10 @@
           <w:tcPr>
             <w:tcW w:type="dxa" w:w="1656"/>
             <w:tcMar>
-              <w:top w:w="80" w:type="dxa"/>
-              <w:bottom w:w="80" w:type="dxa"/>
-              <w:left w:w="100" w:type="dxa"/>
-              <w:right w:w="100" w:type="dxa"/>
+              <w:top w:w="70" w:type="dxa"/>
+              <w:bottom w:w="70" w:type="dxa"/>
+              <w:left w:w="90" w:type="dxa"/>
+              <w:right w:w="90" w:type="dxa"/>
             </w:tcMar>
           </w:tcPr>
           <w:p>
@@ -1340,10 +2447,10 @@
           <w:tcPr>
             <w:tcW w:type="dxa" w:w="1656"/>
             <w:tcMar>
-              <w:top w:w="80" w:type="dxa"/>
-              <w:bottom w:w="80" w:type="dxa"/>
-              <w:left w:w="100" w:type="dxa"/>
-              <w:right w:w="100" w:type="dxa"/>
+              <w:top w:w="70" w:type="dxa"/>
+              <w:bottom w:w="70" w:type="dxa"/>
+              <w:left w:w="90" w:type="dxa"/>
+              <w:right w:w="90" w:type="dxa"/>
             </w:tcMar>
           </w:tcPr>
           <w:p>
@@ -1358,10 +2465,10 @@
           <w:tcPr>
             <w:tcW w:type="dxa" w:w="1656"/>
             <w:tcMar>
-              <w:top w:w="80" w:type="dxa"/>
-              <w:bottom w:w="80" w:type="dxa"/>
-              <w:left w:w="100" w:type="dxa"/>
-              <w:right w:w="100" w:type="dxa"/>
+              <w:top w:w="70" w:type="dxa"/>
+              <w:bottom w:w="70" w:type="dxa"/>
+              <w:left w:w="90" w:type="dxa"/>
+              <w:right w:w="90" w:type="dxa"/>
             </w:tcMar>
           </w:tcPr>
           <w:p>
@@ -1374,10 +2481,10 @@
           <w:tcPr>
             <w:tcW w:type="dxa" w:w="1656"/>
             <w:tcMar>
-              <w:top w:w="80" w:type="dxa"/>
-              <w:bottom w:w="80" w:type="dxa"/>
-              <w:left w:w="100" w:type="dxa"/>
-              <w:right w:w="100" w:type="dxa"/>
+              <w:top w:w="70" w:type="dxa"/>
+              <w:bottom w:w="70" w:type="dxa"/>
+              <w:left w:w="90" w:type="dxa"/>
+              <w:right w:w="90" w:type="dxa"/>
             </w:tcMar>
           </w:tcPr>
           <w:p>
@@ -1390,10 +2497,10 @@
           <w:tcPr>
             <w:tcW w:type="dxa" w:w="1656"/>
             <w:tcMar>
-              <w:top w:w="80" w:type="dxa"/>
-              <w:bottom w:w="80" w:type="dxa"/>
-              <w:left w:w="100" w:type="dxa"/>
-              <w:right w:w="100" w:type="dxa"/>
+              <w:top w:w="70" w:type="dxa"/>
+              <w:bottom w:w="70" w:type="dxa"/>
+              <w:left w:w="90" w:type="dxa"/>
+              <w:right w:w="90" w:type="dxa"/>
             </w:tcMar>
           </w:tcPr>
           <w:p>
@@ -1406,10 +2513,10 @@
           <w:tcPr>
             <w:tcW w:type="dxa" w:w="1656"/>
             <w:tcMar>
-              <w:top w:w="80" w:type="dxa"/>
-              <w:bottom w:w="80" w:type="dxa"/>
-              <w:left w:w="100" w:type="dxa"/>
-              <w:right w:w="100" w:type="dxa"/>
+              <w:top w:w="70" w:type="dxa"/>
+              <w:bottom w:w="70" w:type="dxa"/>
+              <w:left w:w="90" w:type="dxa"/>
+              <w:right w:w="90" w:type="dxa"/>
             </w:tcMar>
           </w:tcPr>
           <w:p>
@@ -1422,10 +2529,10 @@
           <w:tcPr>
             <w:tcW w:type="dxa" w:w="1656"/>
             <w:tcMar>
-              <w:top w:w="80" w:type="dxa"/>
-              <w:bottom w:w="80" w:type="dxa"/>
-              <w:left w:w="100" w:type="dxa"/>
-              <w:right w:w="100" w:type="dxa"/>
+              <w:top w:w="70" w:type="dxa"/>
+              <w:bottom w:w="70" w:type="dxa"/>
+              <w:left w:w="90" w:type="dxa"/>
+              <w:right w:w="90" w:type="dxa"/>
             </w:tcMar>
           </w:tcPr>
           <w:p>
@@ -1440,10 +2547,10 @@
           <w:tcPr>
             <w:tcW w:type="dxa" w:w="1656"/>
             <w:tcMar>
-              <w:top w:w="80" w:type="dxa"/>
-              <w:bottom w:w="80" w:type="dxa"/>
-              <w:left w:w="100" w:type="dxa"/>
-              <w:right w:w="100" w:type="dxa"/>
+              <w:top w:w="70" w:type="dxa"/>
+              <w:bottom w:w="70" w:type="dxa"/>
+              <w:left w:w="90" w:type="dxa"/>
+              <w:right w:w="90" w:type="dxa"/>
             </w:tcMar>
             <w:shd w:val="clear" w:color="auto" w:fill="F2F4F7"/>
           </w:tcPr>
@@ -1460,10 +2567,10 @@
           <w:tcPr>
             <w:tcW w:type="dxa" w:w="1656"/>
             <w:tcMar>
-              <w:top w:w="80" w:type="dxa"/>
-              <w:bottom w:w="80" w:type="dxa"/>
-              <w:left w:w="100" w:type="dxa"/>
-              <w:right w:w="100" w:type="dxa"/>
+              <w:top w:w="70" w:type="dxa"/>
+              <w:bottom w:w="70" w:type="dxa"/>
+              <w:left w:w="90" w:type="dxa"/>
+              <w:right w:w="90" w:type="dxa"/>
             </w:tcMar>
             <w:shd w:val="clear" w:color="auto" w:fill="F2F4F7"/>
           </w:tcPr>
@@ -1480,10 +2587,10 @@
           <w:tcPr>
             <w:tcW w:type="dxa" w:w="1656"/>
             <w:tcMar>
-              <w:top w:w="80" w:type="dxa"/>
-              <w:bottom w:w="80" w:type="dxa"/>
-              <w:left w:w="100" w:type="dxa"/>
-              <w:right w:w="100" w:type="dxa"/>
+              <w:top w:w="70" w:type="dxa"/>
+              <w:bottom w:w="70" w:type="dxa"/>
+              <w:left w:w="90" w:type="dxa"/>
+              <w:right w:w="90" w:type="dxa"/>
             </w:tcMar>
             <w:shd w:val="clear" w:color="auto" w:fill="F2F4F7"/>
           </w:tcPr>
@@ -1500,10 +2607,10 @@
           <w:tcPr>
             <w:tcW w:type="dxa" w:w="1656"/>
             <w:tcMar>
-              <w:top w:w="80" w:type="dxa"/>
-              <w:bottom w:w="80" w:type="dxa"/>
-              <w:left w:w="100" w:type="dxa"/>
-              <w:right w:w="100" w:type="dxa"/>
+              <w:top w:w="70" w:type="dxa"/>
+              <w:bottom w:w="70" w:type="dxa"/>
+              <w:left w:w="90" w:type="dxa"/>
+              <w:right w:w="90" w:type="dxa"/>
             </w:tcMar>
             <w:shd w:val="clear" w:color="auto" w:fill="F2F4F7"/>
           </w:tcPr>
@@ -1520,10 +2627,10 @@
           <w:tcPr>
             <w:tcW w:type="dxa" w:w="1656"/>
             <w:tcMar>
-              <w:top w:w="80" w:type="dxa"/>
-              <w:bottom w:w="80" w:type="dxa"/>
-              <w:left w:w="100" w:type="dxa"/>
-              <w:right w:w="100" w:type="dxa"/>
+              <w:top w:w="70" w:type="dxa"/>
+              <w:bottom w:w="70" w:type="dxa"/>
+              <w:left w:w="90" w:type="dxa"/>
+              <w:right w:w="90" w:type="dxa"/>
             </w:tcMar>
             <w:shd w:val="clear" w:color="auto" w:fill="F2F4F7"/>
           </w:tcPr>
@@ -1540,22 +2647,13 @@
     </w:tbl>
     <w:p>
       <w:pPr>
-        <w:ind w:firstLine="576"/>
-        <w:jc w:val="both"/>
-      </w:pPr>
-      <w:r>
-        <w:t>Hasil pengujian menunjukkan bahwa arus lalu lintas didominasi oleh kendaraan ringan (Car) sebesar 75.00%, diikuti oleh angkutan logistik (Truck) sebesar 20.19%, dan bus antarkota (Bus) sebesar 4.81%.</w:t>
-      </w:r>
-    </w:p>
-    <w:p>
-      <w:pPr>
         <w:spacing w:after="120"/>
       </w:pPr>
       <w:r>
         <w:rPr>
           <w:b/>
         </w:rPr>
-        <w:t>4.4 Pembahasan Komparatif: Volume Garis Hitung vs. Total ID Terdaftar</w:t>
+        <w:t>4.4 Pembahasan Dekomposisi ID: Volume Counting (312) vs Total ID Tracker (427)</w:t>
       </w:r>
     </w:p>
     <w:p>
@@ -1564,7 +2662,7 @@
         <w:jc w:val="both"/>
       </w:pPr>
       <w:r>
-        <w:t>Pada ringkasan statistik sistem, tercatat metrik Total Melintasi Garis = 312 Unit, sedangkan Total ID Terdaftar pada Tracker = 427 ID. Selisih sebesar 115 ID ini merupakan fenomena alami dalam pelacakan multi-objek pada area kamera terbuka. Analisis dekomposisi ID dijabarkan pada Tabel 4.4.</w:t>
+        <w:t>Terdapat perbedaan antara Total Kendaraan Melintasi Garis (312 unit) dan Total ID yang Terdaftar pada Tracker (427 ID). Analisis mengenai selisih 115 ID dijabarkan pada Tabel 4.4.</w:t>
       </w:r>
     </w:p>
     <w:p>
@@ -1575,7 +2673,7 @@
         <w:rPr>
           <w:b/>
         </w:rPr>
-        <w:t>Tabel 4.4 Analisis Perbedaan Metrik Counting Line vs. Total ID Tracker</w:t>
+        <w:t>Tabel 4.4 Analisis Dekomposisi Metrik Counting Line vs. Tracker Lifecycle Pool</w:t>
       </w:r>
     </w:p>
     <w:tbl>
@@ -1595,10 +2693,10 @@
           <w:tcPr>
             <w:tcW w:type="dxa" w:w="2070"/>
             <w:tcMar>
-              <w:top w:w="80" w:type="dxa"/>
-              <w:bottom w:w="80" w:type="dxa"/>
-              <w:left w:w="100" w:type="dxa"/>
-              <w:right w:w="100" w:type="dxa"/>
+              <w:top w:w="70" w:type="dxa"/>
+              <w:bottom w:w="70" w:type="dxa"/>
+              <w:left w:w="90" w:type="dxa"/>
+              <w:right w:w="90" w:type="dxa"/>
             </w:tcMar>
             <w:shd w:val="clear" w:color="auto" w:fill="E8EEF5"/>
           </w:tcPr>
@@ -1615,10 +2713,10 @@
           <w:tcPr>
             <w:tcW w:type="dxa" w:w="2070"/>
             <w:tcMar>
-              <w:top w:w="80" w:type="dxa"/>
-              <w:bottom w:w="80" w:type="dxa"/>
-              <w:left w:w="100" w:type="dxa"/>
-              <w:right w:w="100" w:type="dxa"/>
+              <w:top w:w="70" w:type="dxa"/>
+              <w:bottom w:w="70" w:type="dxa"/>
+              <w:left w:w="90" w:type="dxa"/>
+              <w:right w:w="90" w:type="dxa"/>
             </w:tcMar>
             <w:shd w:val="clear" w:color="auto" w:fill="E8EEF5"/>
           </w:tcPr>
@@ -1627,7 +2725,7 @@
               <w:rPr>
                 <w:b/>
               </w:rPr>
-              <w:t>Estimasi ID</w:t>
+              <w:t>Jumlah ID</w:t>
             </w:r>
           </w:p>
         </w:tc>
@@ -1635,10 +2733,10 @@
           <w:tcPr>
             <w:tcW w:type="dxa" w:w="2070"/>
             <w:tcMar>
-              <w:top w:w="80" w:type="dxa"/>
-              <w:bottom w:w="80" w:type="dxa"/>
-              <w:left w:w="100" w:type="dxa"/>
-              <w:right w:w="100" w:type="dxa"/>
+              <w:top w:w="70" w:type="dxa"/>
+              <w:bottom w:w="70" w:type="dxa"/>
+              <w:left w:w="90" w:type="dxa"/>
+              <w:right w:w="90" w:type="dxa"/>
             </w:tcMar>
             <w:shd w:val="clear" w:color="auto" w:fill="E8EEF5"/>
           </w:tcPr>
@@ -1655,10 +2753,10 @@
           <w:tcPr>
             <w:tcW w:type="dxa" w:w="2070"/>
             <w:tcMar>
-              <w:top w:w="80" w:type="dxa"/>
-              <w:bottom w:w="80" w:type="dxa"/>
-              <w:left w:w="100" w:type="dxa"/>
-              <w:right w:w="100" w:type="dxa"/>
+              <w:top w:w="70" w:type="dxa"/>
+              <w:bottom w:w="70" w:type="dxa"/>
+              <w:left w:w="90" w:type="dxa"/>
+              <w:right w:w="90" w:type="dxa"/>
             </w:tcMar>
             <w:shd w:val="clear" w:color="auto" w:fill="E8EEF5"/>
           </w:tcPr>
@@ -1677,10 +2775,10 @@
           <w:tcPr>
             <w:tcW w:type="dxa" w:w="2070"/>
             <w:tcMar>
-              <w:top w:w="80" w:type="dxa"/>
-              <w:bottom w:w="80" w:type="dxa"/>
-              <w:left w:w="100" w:type="dxa"/>
-              <w:right w:w="100" w:type="dxa"/>
+              <w:top w:w="70" w:type="dxa"/>
+              <w:bottom w:w="70" w:type="dxa"/>
+              <w:left w:w="90" w:type="dxa"/>
+              <w:right w:w="90" w:type="dxa"/>
             </w:tcMar>
           </w:tcPr>
           <w:p>
@@ -1693,10 +2791,10 @@
           <w:tcPr>
             <w:tcW w:type="dxa" w:w="2070"/>
             <w:tcMar>
-              <w:top w:w="80" w:type="dxa"/>
-              <w:bottom w:w="80" w:type="dxa"/>
-              <w:left w:w="100" w:type="dxa"/>
-              <w:right w:w="100" w:type="dxa"/>
+              <w:top w:w="70" w:type="dxa"/>
+              <w:bottom w:w="70" w:type="dxa"/>
+              <w:left w:w="90" w:type="dxa"/>
+              <w:right w:w="90" w:type="dxa"/>
             </w:tcMar>
           </w:tcPr>
           <w:p>
@@ -1709,15 +2807,15 @@
           <w:tcPr>
             <w:tcW w:type="dxa" w:w="2070"/>
             <w:tcMar>
-              <w:top w:w="80" w:type="dxa"/>
-              <w:bottom w:w="80" w:type="dxa"/>
-              <w:left w:w="100" w:type="dxa"/>
-              <w:right w:w="100" w:type="dxa"/>
+              <w:top w:w="70" w:type="dxa"/>
+              <w:bottom w:w="70" w:type="dxa"/>
+              <w:left w:w="90" w:type="dxa"/>
+              <w:right w:w="90" w:type="dxa"/>
             </w:tcMar>
           </w:tcPr>
           <w:p>
             <w:r>
-              <w:t>VALID (Masuk Log CSV)</w:t>
+              <w:t>VALID (Tercatat di CSV)</w:t>
             </w:r>
           </w:p>
         </w:tc>
@@ -1725,10 +2823,10 @@
           <w:tcPr>
             <w:tcW w:type="dxa" w:w="2070"/>
             <w:tcMar>
-              <w:top w:w="80" w:type="dxa"/>
-              <w:bottom w:w="80" w:type="dxa"/>
-              <w:left w:w="100" w:type="dxa"/>
-              <w:right w:w="100" w:type="dxa"/>
+              <w:top w:w="70" w:type="dxa"/>
+              <w:bottom w:w="70" w:type="dxa"/>
+              <w:left w:w="90" w:type="dxa"/>
+              <w:right w:w="90" w:type="dxa"/>
             </w:tcMar>
           </w:tcPr>
           <w:p>
@@ -1743,10 +2841,10 @@
           <w:tcPr>
             <w:tcW w:type="dxa" w:w="2070"/>
             <w:tcMar>
-              <w:top w:w="80" w:type="dxa"/>
-              <w:bottom w:w="80" w:type="dxa"/>
-              <w:left w:w="100" w:type="dxa"/>
-              <w:right w:w="100" w:type="dxa"/>
+              <w:top w:w="70" w:type="dxa"/>
+              <w:bottom w:w="70" w:type="dxa"/>
+              <w:left w:w="90" w:type="dxa"/>
+              <w:right w:w="90" w:type="dxa"/>
             </w:tcMar>
           </w:tcPr>
           <w:p>
@@ -1759,10 +2857,10 @@
           <w:tcPr>
             <w:tcW w:type="dxa" w:w="2070"/>
             <w:tcMar>
-              <w:top w:w="80" w:type="dxa"/>
-              <w:bottom w:w="80" w:type="dxa"/>
-              <w:left w:w="100" w:type="dxa"/>
-              <w:right w:w="100" w:type="dxa"/>
+              <w:top w:w="70" w:type="dxa"/>
+              <w:bottom w:w="70" w:type="dxa"/>
+              <w:left w:w="90" w:type="dxa"/>
+              <w:right w:w="90" w:type="dxa"/>
             </w:tcMar>
           </w:tcPr>
           <w:p>
@@ -1775,10 +2873,10 @@
           <w:tcPr>
             <w:tcW w:type="dxa" w:w="2070"/>
             <w:tcMar>
-              <w:top w:w="80" w:type="dxa"/>
-              <w:bottom w:w="80" w:type="dxa"/>
-              <w:left w:w="100" w:type="dxa"/>
-              <w:right w:w="100" w:type="dxa"/>
+              <w:top w:w="70" w:type="dxa"/>
+              <w:bottom w:w="70" w:type="dxa"/>
+              <w:left w:w="90" w:type="dxa"/>
+              <w:right w:w="90" w:type="dxa"/>
             </w:tcMar>
           </w:tcPr>
           <w:p>
@@ -1791,10 +2889,10 @@
           <w:tcPr>
             <w:tcW w:type="dxa" w:w="2070"/>
             <w:tcMar>
-              <w:top w:w="80" w:type="dxa"/>
-              <w:bottom w:w="80" w:type="dxa"/>
-              <w:left w:w="100" w:type="dxa"/>
-              <w:right w:w="100" w:type="dxa"/>
+              <w:top w:w="70" w:type="dxa"/>
+              <w:bottom w:w="70" w:type="dxa"/>
+              <w:left w:w="90" w:type="dxa"/>
+              <w:right w:w="90" w:type="dxa"/>
             </w:tcMar>
           </w:tcPr>
           <w:p>
@@ -1809,10 +2907,10 @@
           <w:tcPr>
             <w:tcW w:type="dxa" w:w="2070"/>
             <w:tcMar>
-              <w:top w:w="80" w:type="dxa"/>
-              <w:bottom w:w="80" w:type="dxa"/>
-              <w:left w:w="100" w:type="dxa"/>
-              <w:right w:w="100" w:type="dxa"/>
+              <w:top w:w="70" w:type="dxa"/>
+              <w:bottom w:w="70" w:type="dxa"/>
+              <w:left w:w="90" w:type="dxa"/>
+              <w:right w:w="90" w:type="dxa"/>
             </w:tcMar>
           </w:tcPr>
           <w:p>
@@ -1825,10 +2923,10 @@
           <w:tcPr>
             <w:tcW w:type="dxa" w:w="2070"/>
             <w:tcMar>
-              <w:top w:w="80" w:type="dxa"/>
-              <w:bottom w:w="80" w:type="dxa"/>
-              <w:left w:w="100" w:type="dxa"/>
-              <w:right w:w="100" w:type="dxa"/>
+              <w:top w:w="70" w:type="dxa"/>
+              <w:bottom w:w="70" w:type="dxa"/>
+              <w:left w:w="90" w:type="dxa"/>
+              <w:right w:w="90" w:type="dxa"/>
             </w:tcMar>
           </w:tcPr>
           <w:p>
@@ -1841,10 +2939,10 @@
           <w:tcPr>
             <w:tcW w:type="dxa" w:w="2070"/>
             <w:tcMar>
-              <w:top w:w="80" w:type="dxa"/>
-              <w:bottom w:w="80" w:type="dxa"/>
-              <w:left w:w="100" w:type="dxa"/>
-              <w:right w:w="100" w:type="dxa"/>
+              <w:top w:w="70" w:type="dxa"/>
+              <w:bottom w:w="70" w:type="dxa"/>
+              <w:left w:w="90" w:type="dxa"/>
+              <w:right w:w="90" w:type="dxa"/>
             </w:tcMar>
           </w:tcPr>
           <w:p>
@@ -1857,10 +2955,10 @@
           <w:tcPr>
             <w:tcW w:type="dxa" w:w="2070"/>
             <w:tcMar>
-              <w:top w:w="80" w:type="dxa"/>
-              <w:bottom w:w="80" w:type="dxa"/>
-              <w:left w:w="100" w:type="dxa"/>
-              <w:right w:w="100" w:type="dxa"/>
+              <w:top w:w="70" w:type="dxa"/>
+              <w:bottom w:w="70" w:type="dxa"/>
+              <w:left w:w="90" w:type="dxa"/>
+              <w:right w:w="90" w:type="dxa"/>
             </w:tcMar>
           </w:tcPr>
           <w:p>
@@ -1875,10 +2973,10 @@
           <w:tcPr>
             <w:tcW w:type="dxa" w:w="2070"/>
             <w:tcMar>
-              <w:top w:w="80" w:type="dxa"/>
-              <w:bottom w:w="80" w:type="dxa"/>
-              <w:left w:w="100" w:type="dxa"/>
-              <w:right w:w="100" w:type="dxa"/>
+              <w:top w:w="70" w:type="dxa"/>
+              <w:bottom w:w="70" w:type="dxa"/>
+              <w:left w:w="90" w:type="dxa"/>
+              <w:right w:w="90" w:type="dxa"/>
             </w:tcMar>
           </w:tcPr>
           <w:p>
@@ -1891,10 +2989,10 @@
           <w:tcPr>
             <w:tcW w:type="dxa" w:w="2070"/>
             <w:tcMar>
-              <w:top w:w="80" w:type="dxa"/>
-              <w:bottom w:w="80" w:type="dxa"/>
-              <w:left w:w="100" w:type="dxa"/>
-              <w:right w:w="100" w:type="dxa"/>
+              <w:top w:w="70" w:type="dxa"/>
+              <w:bottom w:w="70" w:type="dxa"/>
+              <w:left w:w="90" w:type="dxa"/>
+              <w:right w:w="90" w:type="dxa"/>
             </w:tcMar>
           </w:tcPr>
           <w:p>
@@ -1907,10 +3005,10 @@
           <w:tcPr>
             <w:tcW w:type="dxa" w:w="2070"/>
             <w:tcMar>
-              <w:top w:w="80" w:type="dxa"/>
-              <w:bottom w:w="80" w:type="dxa"/>
-              <w:left w:w="100" w:type="dxa"/>
-              <w:right w:w="100" w:type="dxa"/>
+              <w:top w:w="70" w:type="dxa"/>
+              <w:bottom w:w="70" w:type="dxa"/>
+              <w:left w:w="90" w:type="dxa"/>
+              <w:right w:w="90" w:type="dxa"/>
             </w:tcMar>
           </w:tcPr>
           <w:p>
@@ -1923,10 +3021,10 @@
           <w:tcPr>
             <w:tcW w:type="dxa" w:w="2070"/>
             <w:tcMar>
-              <w:top w:w="80" w:type="dxa"/>
-              <w:bottom w:w="80" w:type="dxa"/>
-              <w:left w:w="100" w:type="dxa"/>
-              <w:right w:w="100" w:type="dxa"/>
+              <w:top w:w="70" w:type="dxa"/>
+              <w:bottom w:w="70" w:type="dxa"/>
+              <w:left w:w="90" w:type="dxa"/>
+              <w:right w:w="90" w:type="dxa"/>
             </w:tcMar>
           </w:tcPr>
           <w:p>
@@ -1943,7 +3041,7 @@
         <w:jc w:val="both"/>
       </w:pPr>
       <w:r>
-        <w:t>Hasil ini membuktikan efektivitas pendekatan Virtual Tripwire sebagai filter integritas data. Meskipun kondisi cuaca hujan memicu noise deteksi di kejauhan, data volume resmi yang tercatat di CSV tetap murni 100% merepresentasikan kendaraan fisik nyata tanpa terdistorsi.</w:t>
+        <w:t>Penjelasan ini mengonfirmasi bahwa angka 312 unit adalah volume lalu lintas sah yang terverifikasi, sedangkan modul Split-Lane Tripwire berhasil menyaring derau lingkungan dan objek luar batas sehingga tidak mengotori data pencatatan resmi.</w:t>
       </w:r>
     </w:p>
     <w:p>
@@ -1954,7 +3052,7 @@
         <w:rPr>
           <w:b/>
         </w:rPr>
-        <w:t>4.5 Contoh Log Data Hasil Tracking (Format CSV)</w:t>
+        <w:t>4.5 Kesimpulan Bab IV</w:t>
       </w:r>
     </w:p>
     <w:p>
@@ -1963,884 +3061,11 @@
         <w:jc w:val="both"/>
       </w:pPr>
       <w:r>
-        <w:t>Sistem secara otomatis mengekspor data granular setiap kendaraan saat menyentuh garis virtual. Sampel log data disajikan pada Tabel 4.5.</w:t>
-      </w:r>
-    </w:p>
-    <w:p>
-      <w:pPr>
-        <w:spacing w:after="80"/>
-      </w:pPr>
-      <w:r>
-        <w:rPr>
-          <w:b/>
-        </w:rPr>
-        <w:t>Tabel 4.5 Sampel Log Data Kendaraan Melintasi Garis (Format CSV)</w:t>
-      </w:r>
-    </w:p>
-    <w:tbl>
-      <w:tblPr>
-        <w:tblW w:type="auto" w:w="0"/>
-        <w:jc w:val="center"/>
-        <w:tblLook w:firstColumn="1" w:firstRow="1" w:lastColumn="0" w:lastRow="0" w:noHBand="0" w:noVBand="1" w:val="04A0"/>
-      </w:tblPr>
-      <w:tblGrid>
-        <w:gridCol w:w="1183"/>
-        <w:gridCol w:w="1183"/>
-        <w:gridCol w:w="1183"/>
-        <w:gridCol w:w="1183"/>
-        <w:gridCol w:w="1183"/>
-        <w:gridCol w:w="1183"/>
-        <w:gridCol w:w="1183"/>
-      </w:tblGrid>
-      <w:tr>
-        <w:tc>
-          <w:tcPr>
-            <w:tcW w:type="dxa" w:w="1183"/>
-            <w:tcMar>
-              <w:top w:w="80" w:type="dxa"/>
-              <w:bottom w:w="80" w:type="dxa"/>
-              <w:left w:w="90" w:type="dxa"/>
-              <w:right w:w="90" w:type="dxa"/>
-            </w:tcMar>
-            <w:shd w:val="clear" w:color="auto" w:fill="E8EEF5"/>
-          </w:tcPr>
-          <w:p>
-            <w:r>
-              <w:rPr>
-                <w:b/>
-              </w:rPr>
-              <w:t>No</w:t>
-            </w:r>
-          </w:p>
-        </w:tc>
-        <w:tc>
-          <w:tcPr>
-            <w:tcW w:type="dxa" w:w="1183"/>
-            <w:tcMar>
-              <w:top w:w="80" w:type="dxa"/>
-              <w:bottom w:w="80" w:type="dxa"/>
-              <w:left w:w="90" w:type="dxa"/>
-              <w:right w:w="90" w:type="dxa"/>
-            </w:tcMar>
-            <w:shd w:val="clear" w:color="auto" w:fill="E8EEF5"/>
-          </w:tcPr>
-          <w:p>
-            <w:r>
-              <w:rPr>
-                <w:b/>
-              </w:rPr>
-              <w:t>Track ID</w:t>
-            </w:r>
-          </w:p>
-        </w:tc>
-        <w:tc>
-          <w:tcPr>
-            <w:tcW w:type="dxa" w:w="1183"/>
-            <w:tcMar>
-              <w:top w:w="80" w:type="dxa"/>
-              <w:bottom w:w="80" w:type="dxa"/>
-              <w:left w:w="90" w:type="dxa"/>
-              <w:right w:w="90" w:type="dxa"/>
-            </w:tcMar>
-            <w:shd w:val="clear" w:color="auto" w:fill="E8EEF5"/>
-          </w:tcPr>
-          <w:p>
-            <w:r>
-              <w:rPr>
-                <w:b/>
-              </w:rPr>
-              <w:t>Kelas</w:t>
-            </w:r>
-          </w:p>
-        </w:tc>
-        <w:tc>
-          <w:tcPr>
-            <w:tcW w:type="dxa" w:w="1183"/>
-            <w:tcMar>
-              <w:top w:w="80" w:type="dxa"/>
-              <w:bottom w:w="80" w:type="dxa"/>
-              <w:left w:w="90" w:type="dxa"/>
-              <w:right w:w="90" w:type="dxa"/>
-            </w:tcMar>
-            <w:shd w:val="clear" w:color="auto" w:fill="E8EEF5"/>
-          </w:tcPr>
-          <w:p>
-            <w:r>
-              <w:rPr>
-                <w:b/>
-              </w:rPr>
-              <w:t>Arah</w:t>
-            </w:r>
-          </w:p>
-        </w:tc>
-        <w:tc>
-          <w:tcPr>
-            <w:tcW w:type="dxa" w:w="1183"/>
-            <w:tcMar>
-              <w:top w:w="80" w:type="dxa"/>
-              <w:bottom w:w="80" w:type="dxa"/>
-              <w:left w:w="90" w:type="dxa"/>
-              <w:right w:w="90" w:type="dxa"/>
-            </w:tcMar>
-            <w:shd w:val="clear" w:color="auto" w:fill="E8EEF5"/>
-          </w:tcPr>
-          <w:p>
-            <w:r>
-              <w:rPr>
-                <w:b/>
-              </w:rPr>
-              <w:t>Frame Ke-</w:t>
-            </w:r>
-          </w:p>
-        </w:tc>
-        <w:tc>
-          <w:tcPr>
-            <w:tcW w:type="dxa" w:w="1183"/>
-            <w:tcMar>
-              <w:top w:w="80" w:type="dxa"/>
-              <w:bottom w:w="80" w:type="dxa"/>
-              <w:left w:w="90" w:type="dxa"/>
-              <w:right w:w="90" w:type="dxa"/>
-            </w:tcMar>
-            <w:shd w:val="clear" w:color="auto" w:fill="E8EEF5"/>
-          </w:tcPr>
-          <w:p>
-            <w:r>
-              <w:rPr>
-                <w:b/>
-              </w:rPr>
-              <w:t>Waktu Video</w:t>
-            </w:r>
-          </w:p>
-        </w:tc>
-        <w:tc>
-          <w:tcPr>
-            <w:tcW w:type="dxa" w:w="1183"/>
-            <w:tcMar>
-              <w:top w:w="80" w:type="dxa"/>
-              <w:bottom w:w="80" w:type="dxa"/>
-              <w:left w:w="90" w:type="dxa"/>
-              <w:right w:w="90" w:type="dxa"/>
-            </w:tcMar>
-            <w:shd w:val="clear" w:color="auto" w:fill="E8EEF5"/>
-          </w:tcPr>
-          <w:p>
-            <w:r>
-              <w:rPr>
-                <w:b/>
-              </w:rPr>
-              <w:t>Posisi (X, Y)</w:t>
-            </w:r>
-          </w:p>
-        </w:tc>
-      </w:tr>
-      <w:tr>
-        <w:tc>
-          <w:tcPr>
-            <w:tcW w:type="dxa" w:w="1183"/>
-            <w:tcMar>
-              <w:top w:w="80" w:type="dxa"/>
-              <w:bottom w:w="80" w:type="dxa"/>
-              <w:left w:w="90" w:type="dxa"/>
-              <w:right w:w="90" w:type="dxa"/>
-            </w:tcMar>
-          </w:tcPr>
-          <w:p>
-            <w:r>
-              <w:t>1</w:t>
-            </w:r>
-          </w:p>
-        </w:tc>
-        <w:tc>
-          <w:tcPr>
-            <w:tcW w:type="dxa" w:w="1183"/>
-            <w:tcMar>
-              <w:top w:w="80" w:type="dxa"/>
-              <w:bottom w:w="80" w:type="dxa"/>
-              <w:left w:w="90" w:type="dxa"/>
-              <w:right w:w="90" w:type="dxa"/>
-            </w:tcMar>
-          </w:tcPr>
-          <w:p>
-            <w:r>
-              <w:t>ID 1</w:t>
-            </w:r>
-          </w:p>
-        </w:tc>
-        <w:tc>
-          <w:tcPr>
-            <w:tcW w:type="dxa" w:w="1183"/>
-            <w:tcMar>
-              <w:top w:w="80" w:type="dxa"/>
-              <w:bottom w:w="80" w:type="dxa"/>
-              <w:left w:w="90" w:type="dxa"/>
-              <w:right w:w="90" w:type="dxa"/>
-            </w:tcMar>
-          </w:tcPr>
-          <w:p>
-            <w:r>
-              <w:t>car</w:t>
-            </w:r>
-          </w:p>
-        </w:tc>
-        <w:tc>
-          <w:tcPr>
-            <w:tcW w:type="dxa" w:w="1183"/>
-            <w:tcMar>
-              <w:top w:w="80" w:type="dxa"/>
-              <w:bottom w:w="80" w:type="dxa"/>
-              <w:left w:w="90" w:type="dxa"/>
-              <w:right w:w="90" w:type="dxa"/>
-            </w:tcMar>
-          </w:tcPr>
-          <w:p>
-            <w:r>
-              <w:t>OUT (Keluar)</w:t>
-            </w:r>
-          </w:p>
-        </w:tc>
-        <w:tc>
-          <w:tcPr>
-            <w:tcW w:type="dxa" w:w="1183"/>
-            <w:tcMar>
-              <w:top w:w="80" w:type="dxa"/>
-              <w:bottom w:w="80" w:type="dxa"/>
-              <w:left w:w="90" w:type="dxa"/>
-              <w:right w:w="90" w:type="dxa"/>
-            </w:tcMar>
-          </w:tcPr>
-          <w:p>
-            <w:r>
-              <w:t>5</w:t>
-            </w:r>
-          </w:p>
-        </w:tc>
-        <w:tc>
-          <w:tcPr>
-            <w:tcW w:type="dxa" w:w="1183"/>
-            <w:tcMar>
-              <w:top w:w="80" w:type="dxa"/>
-              <w:bottom w:w="80" w:type="dxa"/>
-              <w:left w:w="90" w:type="dxa"/>
-              <w:right w:w="90" w:type="dxa"/>
-            </w:tcMar>
-          </w:tcPr>
-          <w:p>
-            <w:r>
-              <w:t>00:01.0</w:t>
-            </w:r>
-          </w:p>
-        </w:tc>
-        <w:tc>
-          <w:tcPr>
-            <w:tcW w:type="dxa" w:w="1183"/>
-            <w:tcMar>
-              <w:top w:w="80" w:type="dxa"/>
-              <w:bottom w:w="80" w:type="dxa"/>
-              <w:left w:w="90" w:type="dxa"/>
-              <w:right w:w="90" w:type="dxa"/>
-            </w:tcMar>
-          </w:tcPr>
-          <w:p>
-            <w:r>
-              <w:t>(398, 240)</w:t>
-            </w:r>
-          </w:p>
-        </w:tc>
-      </w:tr>
-      <w:tr>
-        <w:tc>
-          <w:tcPr>
-            <w:tcW w:type="dxa" w:w="1183"/>
-            <w:tcMar>
-              <w:top w:w="80" w:type="dxa"/>
-              <w:bottom w:w="80" w:type="dxa"/>
-              <w:left w:w="90" w:type="dxa"/>
-              <w:right w:w="90" w:type="dxa"/>
-            </w:tcMar>
-          </w:tcPr>
-          <w:p>
-            <w:r>
-              <w:t>2</w:t>
-            </w:r>
-          </w:p>
-        </w:tc>
-        <w:tc>
-          <w:tcPr>
-            <w:tcW w:type="dxa" w:w="1183"/>
-            <w:tcMar>
-              <w:top w:w="80" w:type="dxa"/>
-              <w:bottom w:w="80" w:type="dxa"/>
-              <w:left w:w="90" w:type="dxa"/>
-              <w:right w:w="90" w:type="dxa"/>
-            </w:tcMar>
-          </w:tcPr>
-          <w:p>
-            <w:r>
-              <w:t>ID 2</w:t>
-            </w:r>
-          </w:p>
-        </w:tc>
-        <w:tc>
-          <w:tcPr>
-            <w:tcW w:type="dxa" w:w="1183"/>
-            <w:tcMar>
-              <w:top w:w="80" w:type="dxa"/>
-              <w:bottom w:w="80" w:type="dxa"/>
-              <w:left w:w="90" w:type="dxa"/>
-              <w:right w:w="90" w:type="dxa"/>
-            </w:tcMar>
-          </w:tcPr>
-          <w:p>
-            <w:r>
-              <w:t>truck</w:t>
-            </w:r>
-          </w:p>
-        </w:tc>
-        <w:tc>
-          <w:tcPr>
-            <w:tcW w:type="dxa" w:w="1183"/>
-            <w:tcMar>
-              <w:top w:w="80" w:type="dxa"/>
-              <w:bottom w:w="80" w:type="dxa"/>
-              <w:left w:w="90" w:type="dxa"/>
-              <w:right w:w="90" w:type="dxa"/>
-            </w:tcMar>
-          </w:tcPr>
-          <w:p>
-            <w:r>
-              <w:t>IN (Masuk)</w:t>
-            </w:r>
-          </w:p>
-        </w:tc>
-        <w:tc>
-          <w:tcPr>
-            <w:tcW w:type="dxa" w:w="1183"/>
-            <w:tcMar>
-              <w:top w:w="80" w:type="dxa"/>
-              <w:bottom w:w="80" w:type="dxa"/>
-              <w:left w:w="90" w:type="dxa"/>
-              <w:right w:w="90" w:type="dxa"/>
-            </w:tcMar>
-          </w:tcPr>
-          <w:p>
-            <w:r>
-              <w:t>18</w:t>
-            </w:r>
-          </w:p>
-        </w:tc>
-        <w:tc>
-          <w:tcPr>
-            <w:tcW w:type="dxa" w:w="1183"/>
-            <w:tcMar>
-              <w:top w:w="80" w:type="dxa"/>
-              <w:bottom w:w="80" w:type="dxa"/>
-              <w:left w:w="90" w:type="dxa"/>
-              <w:right w:w="90" w:type="dxa"/>
-            </w:tcMar>
-          </w:tcPr>
-          <w:p>
-            <w:r>
-              <w:t>00:03.7</w:t>
-            </w:r>
-          </w:p>
-        </w:tc>
-        <w:tc>
-          <w:tcPr>
-            <w:tcW w:type="dxa" w:w="1183"/>
-            <w:tcMar>
-              <w:top w:w="80" w:type="dxa"/>
-              <w:bottom w:w="80" w:type="dxa"/>
-              <w:left w:w="90" w:type="dxa"/>
-              <w:right w:w="90" w:type="dxa"/>
-            </w:tcMar>
-          </w:tcPr>
-          <w:p>
-            <w:r>
-              <w:t>(1071, 326)</w:t>
-            </w:r>
-          </w:p>
-        </w:tc>
-      </w:tr>
-      <w:tr>
-        <w:tc>
-          <w:tcPr>
-            <w:tcW w:type="dxa" w:w="1183"/>
-            <w:tcMar>
-              <w:top w:w="80" w:type="dxa"/>
-              <w:bottom w:w="80" w:type="dxa"/>
-              <w:left w:w="90" w:type="dxa"/>
-              <w:right w:w="90" w:type="dxa"/>
-            </w:tcMar>
-          </w:tcPr>
-          <w:p>
-            <w:r>
-              <w:t>6</w:t>
-            </w:r>
-          </w:p>
-        </w:tc>
-        <w:tc>
-          <w:tcPr>
-            <w:tcW w:type="dxa" w:w="1183"/>
-            <w:tcMar>
-              <w:top w:w="80" w:type="dxa"/>
-              <w:bottom w:w="80" w:type="dxa"/>
-              <w:left w:w="90" w:type="dxa"/>
-              <w:right w:w="90" w:type="dxa"/>
-            </w:tcMar>
-          </w:tcPr>
-          <w:p>
-            <w:r>
-              <w:t>ID 15</w:t>
-            </w:r>
-          </w:p>
-        </w:tc>
-        <w:tc>
-          <w:tcPr>
-            <w:tcW w:type="dxa" w:w="1183"/>
-            <w:tcMar>
-              <w:top w:w="80" w:type="dxa"/>
-              <w:bottom w:w="80" w:type="dxa"/>
-              <w:left w:w="90" w:type="dxa"/>
-              <w:right w:w="90" w:type="dxa"/>
-            </w:tcMar>
-          </w:tcPr>
-          <w:p>
-            <w:r>
-              <w:t>bus</w:t>
-            </w:r>
-          </w:p>
-        </w:tc>
-        <w:tc>
-          <w:tcPr>
-            <w:tcW w:type="dxa" w:w="1183"/>
-            <w:tcMar>
-              <w:top w:w="80" w:type="dxa"/>
-              <w:bottom w:w="80" w:type="dxa"/>
-              <w:left w:w="90" w:type="dxa"/>
-              <w:right w:w="90" w:type="dxa"/>
-            </w:tcMar>
-          </w:tcPr>
-          <w:p>
-            <w:r>
-              <w:t>OUT (Keluar)</w:t>
-            </w:r>
-          </w:p>
-        </w:tc>
-        <w:tc>
-          <w:tcPr>
-            <w:tcW w:type="dxa" w:w="1183"/>
-            <w:tcMar>
-              <w:top w:w="80" w:type="dxa"/>
-              <w:bottom w:w="80" w:type="dxa"/>
-              <w:left w:w="90" w:type="dxa"/>
-              <w:right w:w="90" w:type="dxa"/>
-            </w:tcMar>
-          </w:tcPr>
-          <w:p>
-            <w:r>
-              <w:t>26</w:t>
-            </w:r>
-          </w:p>
-        </w:tc>
-        <w:tc>
-          <w:tcPr>
-            <w:tcW w:type="dxa" w:w="1183"/>
-            <w:tcMar>
-              <w:top w:w="80" w:type="dxa"/>
-              <w:bottom w:w="80" w:type="dxa"/>
-              <w:left w:w="90" w:type="dxa"/>
-              <w:right w:w="90" w:type="dxa"/>
-            </w:tcMar>
-          </w:tcPr>
-          <w:p>
-            <w:r>
-              <w:t>00:05.3</w:t>
-            </w:r>
-          </w:p>
-        </w:tc>
-        <w:tc>
-          <w:tcPr>
-            <w:tcW w:type="dxa" w:w="1183"/>
-            <w:tcMar>
-              <w:top w:w="80" w:type="dxa"/>
-              <w:bottom w:w="80" w:type="dxa"/>
-              <w:left w:w="90" w:type="dxa"/>
-              <w:right w:w="90" w:type="dxa"/>
-            </w:tcMar>
-          </w:tcPr>
-          <w:p>
-            <w:r>
-              <w:t>(379, 308)</w:t>
-            </w:r>
-          </w:p>
-        </w:tc>
-      </w:tr>
-      <w:tr>
-        <w:tc>
-          <w:tcPr>
-            <w:tcW w:type="dxa" w:w="1183"/>
-            <w:tcMar>
-              <w:top w:w="80" w:type="dxa"/>
-              <w:bottom w:w="80" w:type="dxa"/>
-              <w:left w:w="90" w:type="dxa"/>
-              <w:right w:w="90" w:type="dxa"/>
-            </w:tcMar>
-          </w:tcPr>
-          <w:p>
-            <w:r>
-              <w:t>10</w:t>
-            </w:r>
-          </w:p>
-        </w:tc>
-        <w:tc>
-          <w:tcPr>
-            <w:tcW w:type="dxa" w:w="1183"/>
-            <w:tcMar>
-              <w:top w:w="80" w:type="dxa"/>
-              <w:bottom w:w="80" w:type="dxa"/>
-              <w:left w:w="90" w:type="dxa"/>
-              <w:right w:w="90" w:type="dxa"/>
-            </w:tcMar>
-          </w:tcPr>
-          <w:p>
-            <w:r>
-              <w:t>ID 12</w:t>
-            </w:r>
-          </w:p>
-        </w:tc>
-        <w:tc>
-          <w:tcPr>
-            <w:tcW w:type="dxa" w:w="1183"/>
-            <w:tcMar>
-              <w:top w:w="80" w:type="dxa"/>
-              <w:bottom w:w="80" w:type="dxa"/>
-              <w:left w:w="90" w:type="dxa"/>
-              <w:right w:w="90" w:type="dxa"/>
-            </w:tcMar>
-          </w:tcPr>
-          <w:p>
-            <w:r>
-              <w:t>truck</w:t>
-            </w:r>
-          </w:p>
-        </w:tc>
-        <w:tc>
-          <w:tcPr>
-            <w:tcW w:type="dxa" w:w="1183"/>
-            <w:tcMar>
-              <w:top w:w="80" w:type="dxa"/>
-              <w:bottom w:w="80" w:type="dxa"/>
-              <w:left w:w="90" w:type="dxa"/>
-              <w:right w:w="90" w:type="dxa"/>
-            </w:tcMar>
-          </w:tcPr>
-          <w:p>
-            <w:r>
-              <w:t>IN (Masuk)</w:t>
-            </w:r>
-          </w:p>
-        </w:tc>
-        <w:tc>
-          <w:tcPr>
-            <w:tcW w:type="dxa" w:w="1183"/>
-            <w:tcMar>
-              <w:top w:w="80" w:type="dxa"/>
-              <w:bottom w:w="80" w:type="dxa"/>
-              <w:left w:w="90" w:type="dxa"/>
-              <w:right w:w="90" w:type="dxa"/>
-            </w:tcMar>
-          </w:tcPr>
-          <w:p>
-            <w:r>
-              <w:t>42</w:t>
-            </w:r>
-          </w:p>
-        </w:tc>
-        <w:tc>
-          <w:tcPr>
-            <w:tcW w:type="dxa" w:w="1183"/>
-            <w:tcMar>
-              <w:top w:w="80" w:type="dxa"/>
-              <w:bottom w:w="80" w:type="dxa"/>
-              <w:left w:w="90" w:type="dxa"/>
-              <w:right w:w="90" w:type="dxa"/>
-            </w:tcMar>
-          </w:tcPr>
-          <w:p>
-            <w:r>
-              <w:t>00:08.6</w:t>
-            </w:r>
-          </w:p>
-        </w:tc>
-        <w:tc>
-          <w:tcPr>
-            <w:tcW w:type="dxa" w:w="1183"/>
-            <w:tcMar>
-              <w:top w:w="80" w:type="dxa"/>
-              <w:bottom w:w="80" w:type="dxa"/>
-              <w:left w:w="90" w:type="dxa"/>
-              <w:right w:w="90" w:type="dxa"/>
-            </w:tcMar>
-          </w:tcPr>
-          <w:p>
-            <w:r>
-              <w:t>(1141, 334)</w:t>
-            </w:r>
-          </w:p>
-        </w:tc>
-      </w:tr>
-      <w:tr>
-        <w:tc>
-          <w:tcPr>
-            <w:tcW w:type="dxa" w:w="1183"/>
-            <w:tcMar>
-              <w:top w:w="80" w:type="dxa"/>
-              <w:bottom w:w="80" w:type="dxa"/>
-              <w:left w:w="90" w:type="dxa"/>
-              <w:right w:w="90" w:type="dxa"/>
-            </w:tcMar>
-          </w:tcPr>
-          <w:p>
-            <w:r>
-              <w:t>100</w:t>
-            </w:r>
-          </w:p>
-        </w:tc>
-        <w:tc>
-          <w:tcPr>
-            <w:tcW w:type="dxa" w:w="1183"/>
-            <w:tcMar>
-              <w:top w:w="80" w:type="dxa"/>
-              <w:bottom w:w="80" w:type="dxa"/>
-              <w:left w:w="90" w:type="dxa"/>
-              <w:right w:w="90" w:type="dxa"/>
-            </w:tcMar>
-          </w:tcPr>
-          <w:p>
-            <w:r>
-              <w:t>ID 179</w:t>
-            </w:r>
-          </w:p>
-        </w:tc>
-        <w:tc>
-          <w:tcPr>
-            <w:tcW w:type="dxa" w:w="1183"/>
-            <w:tcMar>
-              <w:top w:w="80" w:type="dxa"/>
-              <w:bottom w:w="80" w:type="dxa"/>
-              <w:left w:w="90" w:type="dxa"/>
-              <w:right w:w="90" w:type="dxa"/>
-            </w:tcMar>
-          </w:tcPr>
-          <w:p>
-            <w:r>
-              <w:t>bus</w:t>
-            </w:r>
-          </w:p>
-        </w:tc>
-        <w:tc>
-          <w:tcPr>
-            <w:tcW w:type="dxa" w:w="1183"/>
-            <w:tcMar>
-              <w:top w:w="80" w:type="dxa"/>
-              <w:bottom w:w="80" w:type="dxa"/>
-              <w:left w:w="90" w:type="dxa"/>
-              <w:right w:w="90" w:type="dxa"/>
-            </w:tcMar>
-          </w:tcPr>
-          <w:p>
-            <w:r>
-              <w:t>IN (Masuk)</w:t>
-            </w:r>
-          </w:p>
-        </w:tc>
-        <w:tc>
-          <w:tcPr>
-            <w:tcW w:type="dxa" w:w="1183"/>
-            <w:tcMar>
-              <w:top w:w="80" w:type="dxa"/>
-              <w:bottom w:w="80" w:type="dxa"/>
-              <w:left w:w="90" w:type="dxa"/>
-              <w:right w:w="90" w:type="dxa"/>
-            </w:tcMar>
-          </w:tcPr>
-          <w:p>
-            <w:r>
-              <w:t>530</w:t>
-            </w:r>
-          </w:p>
-        </w:tc>
-        <w:tc>
-          <w:tcPr>
-            <w:tcW w:type="dxa" w:w="1183"/>
-            <w:tcMar>
-              <w:top w:w="80" w:type="dxa"/>
-              <w:bottom w:w="80" w:type="dxa"/>
-              <w:left w:w="90" w:type="dxa"/>
-              <w:right w:w="90" w:type="dxa"/>
-            </w:tcMar>
-          </w:tcPr>
-          <w:p>
-            <w:r>
-              <w:t>01:49.6</w:t>
-            </w:r>
-          </w:p>
-        </w:tc>
-        <w:tc>
-          <w:tcPr>
-            <w:tcW w:type="dxa" w:w="1183"/>
-            <w:tcMar>
-              <w:top w:w="80" w:type="dxa"/>
-              <w:bottom w:w="80" w:type="dxa"/>
-              <w:left w:w="90" w:type="dxa"/>
-              <w:right w:w="90" w:type="dxa"/>
-            </w:tcMar>
-          </w:tcPr>
-          <w:p>
-            <w:r>
-              <w:t>(849, 304)</w:t>
-            </w:r>
-          </w:p>
-        </w:tc>
-      </w:tr>
-      <w:tr>
-        <w:tc>
-          <w:tcPr>
-            <w:tcW w:type="dxa" w:w="1183"/>
-            <w:tcMar>
-              <w:top w:w="80" w:type="dxa"/>
-              <w:bottom w:w="80" w:type="dxa"/>
-              <w:left w:w="90" w:type="dxa"/>
-              <w:right w:w="90" w:type="dxa"/>
-            </w:tcMar>
-          </w:tcPr>
-          <w:p>
-            <w:r>
-              <w:t>312</w:t>
-            </w:r>
-          </w:p>
-        </w:tc>
-        <w:tc>
-          <w:tcPr>
-            <w:tcW w:type="dxa" w:w="1183"/>
-            <w:tcMar>
-              <w:top w:w="80" w:type="dxa"/>
-              <w:bottom w:w="80" w:type="dxa"/>
-              <w:left w:w="90" w:type="dxa"/>
-              <w:right w:w="90" w:type="dxa"/>
-            </w:tcMar>
-          </w:tcPr>
-          <w:p>
-            <w:r>
-              <w:t>ID 529</w:t>
-            </w:r>
-          </w:p>
-        </w:tc>
-        <w:tc>
-          <w:tcPr>
-            <w:tcW w:type="dxa" w:w="1183"/>
-            <w:tcMar>
-              <w:top w:w="80" w:type="dxa"/>
-              <w:bottom w:w="80" w:type="dxa"/>
-              <w:left w:w="90" w:type="dxa"/>
-              <w:right w:w="90" w:type="dxa"/>
-            </w:tcMar>
-          </w:tcPr>
-          <w:p>
-            <w:r>
-              <w:t>car</w:t>
-            </w:r>
-          </w:p>
-        </w:tc>
-        <w:tc>
-          <w:tcPr>
-            <w:tcW w:type="dxa" w:w="1183"/>
-            <w:tcMar>
-              <w:top w:w="80" w:type="dxa"/>
-              <w:bottom w:w="80" w:type="dxa"/>
-              <w:left w:w="90" w:type="dxa"/>
-              <w:right w:w="90" w:type="dxa"/>
-            </w:tcMar>
-          </w:tcPr>
-          <w:p>
-            <w:r>
-              <w:t>IN (Masuk)</w:t>
-            </w:r>
-          </w:p>
-        </w:tc>
-        <w:tc>
-          <w:tcPr>
-            <w:tcW w:type="dxa" w:w="1183"/>
-            <w:tcMar>
-              <w:top w:w="80" w:type="dxa"/>
-              <w:bottom w:w="80" w:type="dxa"/>
-              <w:left w:w="90" w:type="dxa"/>
-              <w:right w:w="90" w:type="dxa"/>
-            </w:tcMar>
-          </w:tcPr>
-          <w:p>
-            <w:r>
-              <w:t>1446</w:t>
-            </w:r>
-          </w:p>
-        </w:tc>
-        <w:tc>
-          <w:tcPr>
-            <w:tcW w:type="dxa" w:w="1183"/>
-            <w:tcMar>
-              <w:top w:w="80" w:type="dxa"/>
-              <w:bottom w:w="80" w:type="dxa"/>
-              <w:left w:w="90" w:type="dxa"/>
-              <w:right w:w="90" w:type="dxa"/>
-            </w:tcMar>
-          </w:tcPr>
-          <w:p>
-            <w:r>
-              <w:t>04:59.2</w:t>
-            </w:r>
-          </w:p>
-        </w:tc>
-        <w:tc>
-          <w:tcPr>
-            <w:tcW w:type="dxa" w:w="1183"/>
-            <w:tcMar>
-              <w:top w:w="80" w:type="dxa"/>
-              <w:bottom w:w="80" w:type="dxa"/>
-              <w:left w:w="90" w:type="dxa"/>
-              <w:right w:w="90" w:type="dxa"/>
-            </w:tcMar>
-          </w:tcPr>
-          <w:p>
-            <w:r>
-              <w:t>(1136, 350)</w:t>
-            </w:r>
-          </w:p>
-        </w:tc>
-      </w:tr>
-    </w:tbl>
-    <w:p>
-      <w:pPr>
-        <w:spacing w:after="120"/>
-      </w:pPr>
-      <w:r>
-        <w:rPr>
-          <w:b/>
-        </w:rPr>
-        <w:t>4.6 Kesimpulan Bab IV</w:t>
-      </w:r>
-    </w:p>
-    <w:p>
-      <w:pPr>
-        <w:ind w:firstLine="576"/>
-        <w:jc w:val="both"/>
-      </w:pPr>
-      <w:r>
-        <w:t>1. Integrasi model DEYOLO Dual-Input dan tracker ByteTrack berhasil memproses video cuaca hujan 5 menit secara kontinu dan stabil.</w:t>
+        <w:t>1. Arsitektur DEYOLO EXP-05 (DEPA 3x3, DECA r=8, Sobel Pseudo-IR) terbukti sebagai konfigurasi optimal untuk aplikasi penghitungan lalu lintas dengan Recall 78.97% dan F1-Score 81.34%.</w:t>
         <w:br/>
-        <w:t>2. Volume lalu lintas terhitung sebanyak 312 unit kendaraan (210 unit IN, 102 unit OUT) dengan komposisi 75.00% mobil, 20.19% truk, dan 4.81% bus, setara dengan laju arus 3.736 kendaraan/jam.</w:t>
+        <w:t>2. Sistem pelacakan ByteTrack dan Split-Lane Dual-Tripwire berhasil menghitung 312 unit kendaraan tanpa duplikasi pada video pengujian 5 menit cuaca hujan lebat (210 unit IN, 102 unit OUT).</w:t>
         <w:br/>
-        <w:t>3. Sistem menghasilkan output video mulus H.264 CFR serta paket ZIP berisi data log CSV granular yang siap digunakan untuk analisis rekayasa transportasi.</w:t>
+        <w:t>3. Sistem menghasilkan file video H.264 CFR yang mulus serta ekspor paket ZIP lengkap berisi data log CSV dan ringkasan statistik yang siap dianalisis untuk rekayasa lalu lintas.</w:t>
       </w:r>
     </w:p>
     <w:sectPr>

</xml_diff>